<commit_message>
Saved changes to Dictionary
Modify: Word document dictionary had two more texts added.
Delete: Temporary file that's made when the Word file is open.
</commit_message>
<xml_diff>
--- a/docs/Diccionario de Traducción de Ahorcado.docx
+++ b/docs/Diccionario de Traducción de Ahorcado.docx
@@ -117,9 +117,11 @@
             <w:tcW w:w="0" w:type="auto"/>
           </w:tcPr>
           <w:p>
+            <w:proofErr w:type="spellStart"/>
             <w:r>
               <w:t>Text_gameTitle</w:t>
             </w:r>
+            <w:proofErr w:type="spellEnd"/>
           </w:p>
         </w:tc>
         <w:tc>
@@ -181,6 +183,7 @@
             <w:tcW w:w="0" w:type="auto"/>
           </w:tcPr>
           <w:p>
+            <w:proofErr w:type="spellStart"/>
             <w:r>
               <w:t>Global_</w:t>
             </w:r>
@@ -190,6 +193,7 @@
             <w:r>
               <w:t>gIn</w:t>
             </w:r>
+            <w:proofErr w:type="spellEnd"/>
           </w:p>
         </w:tc>
         <w:tc>
@@ -254,9 +258,11 @@
             <w:tcW w:w="0" w:type="auto"/>
           </w:tcPr>
           <w:p>
+            <w:proofErr w:type="spellStart"/>
             <w:r>
               <w:t>Global_username</w:t>
             </w:r>
+            <w:proofErr w:type="spellEnd"/>
           </w:p>
         </w:tc>
         <w:tc>
@@ -318,9 +324,11 @@
             <w:tcW w:w="0" w:type="auto"/>
           </w:tcPr>
           <w:p>
+            <w:proofErr w:type="spellStart"/>
             <w:r>
               <w:t>Global_password</w:t>
             </w:r>
+            <w:proofErr w:type="spellEnd"/>
           </w:p>
         </w:tc>
         <w:tc>
@@ -385,9 +393,11 @@
             <w:tcW w:w="0" w:type="auto"/>
           </w:tcPr>
           <w:p>
+            <w:proofErr w:type="spellStart"/>
             <w:r>
               <w:t>Error_emptyUser</w:t>
             </w:r>
+            <w:proofErr w:type="spellEnd"/>
           </w:p>
         </w:tc>
         <w:tc>
@@ -497,9 +507,11 @@
             <w:tcW w:w="0" w:type="auto"/>
           </w:tcPr>
           <w:p>
+            <w:proofErr w:type="spellStart"/>
             <w:r>
               <w:t>Error_wrongCredentials</w:t>
             </w:r>
+            <w:proofErr w:type="spellEnd"/>
           </w:p>
         </w:tc>
         <w:tc>
@@ -570,9 +582,11 @@
             <w:tcW w:w="0" w:type="auto"/>
           </w:tcPr>
           <w:p>
+            <w:proofErr w:type="spellStart"/>
             <w:r>
               <w:t>Error_noConnection</w:t>
             </w:r>
+            <w:proofErr w:type="spellEnd"/>
           </w:p>
         </w:tc>
         <w:tc>
@@ -700,9 +714,11 @@
             <w:tcW w:w="0" w:type="auto"/>
           </w:tcPr>
           <w:p>
+            <w:proofErr w:type="spellStart"/>
             <w:r>
               <w:t>Button_signUp</w:t>
             </w:r>
+            <w:proofErr w:type="spellEnd"/>
           </w:p>
         </w:tc>
         <w:tc>
@@ -767,9 +783,11 @@
             <w:tcW w:w="0" w:type="auto"/>
           </w:tcPr>
           <w:p>
+            <w:proofErr w:type="spellStart"/>
             <w:r>
               <w:t>Text_fullName</w:t>
             </w:r>
+            <w:proofErr w:type="spellEnd"/>
           </w:p>
         </w:tc>
         <w:tc>
@@ -831,9 +849,11 @@
             <w:tcW w:w="0" w:type="auto"/>
           </w:tcPr>
           <w:p>
+            <w:proofErr w:type="spellStart"/>
             <w:r>
               <w:t>Text_email</w:t>
             </w:r>
+            <w:proofErr w:type="spellEnd"/>
           </w:p>
         </w:tc>
         <w:tc>
@@ -910,9 +930,11 @@
             <w:tcW w:w="0" w:type="auto"/>
           </w:tcPr>
           <w:p>
+            <w:proofErr w:type="spellStart"/>
             <w:r>
               <w:t>Text_dateOfBirth</w:t>
             </w:r>
+            <w:proofErr w:type="spellEnd"/>
           </w:p>
         </w:tc>
         <w:tc>
@@ -974,9 +996,11 @@
             <w:tcW w:w="0" w:type="auto"/>
           </w:tcPr>
           <w:p>
+            <w:proofErr w:type="spellStart"/>
             <w:r>
               <w:t>Text_phone</w:t>
             </w:r>
+            <w:proofErr w:type="spellEnd"/>
           </w:p>
         </w:tc>
         <w:tc>
@@ -1041,9 +1065,11 @@
             <w:tcW w:w="0" w:type="auto"/>
           </w:tcPr>
           <w:p>
+            <w:proofErr w:type="spellStart"/>
             <w:r>
               <w:t>Text_confirmPassword</w:t>
             </w:r>
+            <w:proofErr w:type="spellEnd"/>
           </w:p>
         </w:tc>
         <w:tc>
@@ -1118,9 +1144,11 @@
             <w:tcW w:w="0" w:type="auto"/>
           </w:tcPr>
           <w:p>
+            <w:proofErr w:type="spellStart"/>
             <w:r>
               <w:t>Button_alreadyRegistered</w:t>
             </w:r>
+            <w:proofErr w:type="spellEnd"/>
           </w:p>
         </w:tc>
         <w:tc>
@@ -1191,9 +1219,11 @@
             <w:tcW w:w="0" w:type="auto"/>
           </w:tcPr>
           <w:p>
+            <w:proofErr w:type="spellStart"/>
             <w:r>
               <w:t>Button_accept</w:t>
             </w:r>
+            <w:proofErr w:type="spellEnd"/>
           </w:p>
         </w:tc>
         <w:tc>
@@ -1253,9 +1283,11 @@
             <w:tcW w:w="0" w:type="auto"/>
           </w:tcPr>
           <w:p>
+            <w:proofErr w:type="spellStart"/>
             <w:r>
               <w:t>Button_cancel</w:t>
             </w:r>
+            <w:proofErr w:type="spellEnd"/>
           </w:p>
         </w:tc>
         <w:tc>
@@ -1320,9 +1352,11 @@
             <w:tcW w:w="0" w:type="auto"/>
           </w:tcPr>
           <w:p>
+            <w:proofErr w:type="spellStart"/>
             <w:r>
               <w:t>Button_createMatch</w:t>
             </w:r>
+            <w:proofErr w:type="spellEnd"/>
           </w:p>
         </w:tc>
         <w:tc>
@@ -1384,9 +1418,11 @@
             <w:tcW w:w="0" w:type="auto"/>
           </w:tcPr>
           <w:p>
+            <w:proofErr w:type="spellStart"/>
             <w:r>
               <w:t>Button_exit</w:t>
             </w:r>
+            <w:proofErr w:type="spellEnd"/>
           </w:p>
         </w:tc>
         <w:tc>
@@ -1451,9 +1487,11 @@
             <w:tcW w:w="0" w:type="auto"/>
           </w:tcPr>
           <w:p>
+            <w:proofErr w:type="spellStart"/>
             <w:r>
               <w:t>Button_joinMatch</w:t>
             </w:r>
+            <w:proofErr w:type="spellEnd"/>
           </w:p>
         </w:tc>
         <w:tc>
@@ -1515,9 +1553,11 @@
             <w:tcW w:w="0" w:type="auto"/>
           </w:tcPr>
           <w:p>
+            <w:proofErr w:type="spellStart"/>
             <w:r>
               <w:t>Button_logOut</w:t>
             </w:r>
+            <w:proofErr w:type="spellEnd"/>
           </w:p>
         </w:tc>
         <w:tc>
@@ -1582,9 +1622,11 @@
             <w:tcW w:w="0" w:type="auto"/>
           </w:tcPr>
           <w:p>
+            <w:proofErr w:type="spellStart"/>
             <w:r>
               <w:t>Button_ok</w:t>
             </w:r>
+            <w:proofErr w:type="spellEnd"/>
           </w:p>
         </w:tc>
         <w:tc>
@@ -1646,10 +1688,12 @@
             <w:tcW w:w="0" w:type="auto"/>
           </w:tcPr>
           <w:p>
+            <w:proofErr w:type="spellStart"/>
             <w:r>
               <w:lastRenderedPageBreak/>
               <w:t>Button_send</w:t>
             </w:r>
+            <w:proofErr w:type="spellEnd"/>
           </w:p>
         </w:tc>
         <w:tc>
@@ -1714,9 +1758,11 @@
             <w:tcW w:w="0" w:type="auto"/>
           </w:tcPr>
           <w:p>
+            <w:proofErr w:type="spellStart"/>
             <w:r>
               <w:t>Error_alreadyLogged</w:t>
             </w:r>
+            <w:proofErr w:type="spellEnd"/>
           </w:p>
         </w:tc>
         <w:tc>
@@ -1778,9 +1824,11 @@
             <w:tcW w:w="0" w:type="auto"/>
           </w:tcPr>
           <w:p>
+            <w:proofErr w:type="spellStart"/>
             <w:r>
               <w:t>Error_generic</w:t>
             </w:r>
+            <w:proofErr w:type="spellEnd"/>
           </w:p>
         </w:tc>
         <w:tc>
@@ -1864,9 +1912,11 @@
             <w:tcW w:w="0" w:type="auto"/>
           </w:tcPr>
           <w:p>
+            <w:proofErr w:type="spellStart"/>
             <w:r>
               <w:t>Error_incompleteFields</w:t>
             </w:r>
+            <w:proofErr w:type="spellEnd"/>
           </w:p>
         </w:tc>
         <w:tc>
@@ -1935,9 +1985,11 @@
             <w:tcW w:w="0" w:type="auto"/>
           </w:tcPr>
           <w:p>
+            <w:proofErr w:type="spellStart"/>
             <w:r>
               <w:t>Error_noCoincidences</w:t>
             </w:r>
+            <w:proofErr w:type="spellEnd"/>
           </w:p>
         </w:tc>
         <w:tc>
@@ -2002,9 +2054,11 @@
             <w:tcW w:w="0" w:type="auto"/>
           </w:tcPr>
           <w:p>
+            <w:proofErr w:type="spellStart"/>
             <w:r>
               <w:t>Error_retrievingData</w:t>
             </w:r>
+            <w:proofErr w:type="spellEnd"/>
           </w:p>
         </w:tc>
         <w:tc>
@@ -2091,9 +2145,11 @@
             <w:tcW w:w="0" w:type="auto"/>
           </w:tcPr>
           <w:p>
+            <w:proofErr w:type="spellStart"/>
             <w:r>
               <w:t>Error_samePassword</w:t>
             </w:r>
+            <w:proofErr w:type="spellEnd"/>
           </w:p>
         </w:tc>
         <w:tc>
@@ -2158,9 +2214,11 @@
             <w:tcW w:w="0" w:type="auto"/>
           </w:tcPr>
           <w:p>
+            <w:proofErr w:type="spellStart"/>
             <w:r>
               <w:t>Error_serverTimeout</w:t>
             </w:r>
+            <w:proofErr w:type="spellEnd"/>
           </w:p>
         </w:tc>
         <w:tc>
@@ -2275,12 +2333,14 @@
             <w:tcW w:w="0" w:type="auto"/>
           </w:tcPr>
           <w:p>
+            <w:proofErr w:type="spellStart"/>
             <w:r>
               <w:t>Error_</w:t>
             </w:r>
             <w:r>
               <w:t>profileUpdate</w:t>
             </w:r>
+            <w:proofErr w:type="spellEnd"/>
           </w:p>
         </w:tc>
         <w:tc>
@@ -2355,9 +2415,11 @@
             <w:tcW w:w="0" w:type="auto"/>
           </w:tcPr>
           <w:p>
+            <w:proofErr w:type="spellStart"/>
             <w:r>
               <w:t>Global_lang</w:t>
             </w:r>
+            <w:proofErr w:type="spellEnd"/>
           </w:p>
         </w:tc>
         <w:tc>
@@ -2419,9 +2481,11 @@
             <w:tcW w:w="0" w:type="auto"/>
           </w:tcPr>
           <w:p>
+            <w:proofErr w:type="spellStart"/>
             <w:r>
               <w:t>Global_settings</w:t>
             </w:r>
+            <w:proofErr w:type="spellEnd"/>
           </w:p>
         </w:tc>
         <w:tc>
@@ -2486,9 +2550,11 @@
             <w:tcW w:w="0" w:type="auto"/>
           </w:tcPr>
           <w:p>
+            <w:proofErr w:type="spellStart"/>
             <w:r>
               <w:t>Title_message</w:t>
             </w:r>
+            <w:proofErr w:type="spellEnd"/>
           </w:p>
         </w:tc>
         <w:tc>
@@ -2550,6 +2616,7 @@
             <w:tcW w:w="0" w:type="auto"/>
           </w:tcPr>
           <w:p>
+            <w:proofErr w:type="spellStart"/>
             <w:r>
               <w:lastRenderedPageBreak/>
               <w:t>Title_</w:t>
@@ -2560,6 +2627,7 @@
             <w:r>
               <w:t>gIn</w:t>
             </w:r>
+            <w:proofErr w:type="spellEnd"/>
           </w:p>
         </w:tc>
         <w:tc>
@@ -2624,9 +2692,11 @@
             <w:tcW w:w="0" w:type="auto"/>
           </w:tcPr>
           <w:p>
+            <w:proofErr w:type="spellStart"/>
             <w:r>
               <w:t>Title_signUp</w:t>
             </w:r>
+            <w:proofErr w:type="spellEnd"/>
           </w:p>
         </w:tc>
         <w:tc>
@@ -2700,9 +2770,11 @@
             <w:tcW w:w="0" w:type="auto"/>
           </w:tcPr>
           <w:p>
+            <w:proofErr w:type="spellStart"/>
             <w:r>
               <w:t>Title_lobby</w:t>
             </w:r>
+            <w:proofErr w:type="spellEnd"/>
           </w:p>
         </w:tc>
         <w:tc>
@@ -2774,9 +2846,11 @@
             <w:tcW w:w="0" w:type="auto"/>
           </w:tcPr>
           <w:p>
+            <w:proofErr w:type="spellStart"/>
             <w:r>
               <w:t>Title_createMatch</w:t>
             </w:r>
+            <w:proofErr w:type="spellEnd"/>
           </w:p>
         </w:tc>
         <w:tc>
@@ -2838,9 +2912,11 @@
             <w:tcW w:w="0" w:type="auto"/>
           </w:tcPr>
           <w:p>
+            <w:proofErr w:type="spellStart"/>
             <w:r>
               <w:t>Title_matchesList</w:t>
             </w:r>
+            <w:proofErr w:type="spellEnd"/>
           </w:p>
         </w:tc>
         <w:tc>
@@ -2905,9 +2981,11 @@
             <w:tcW w:w="0" w:type="auto"/>
           </w:tcPr>
           <w:p>
+            <w:proofErr w:type="spellStart"/>
             <w:r>
               <w:t>Title_profile</w:t>
             </w:r>
+            <w:proofErr w:type="spellEnd"/>
           </w:p>
         </w:tc>
         <w:tc>
@@ -2969,9 +3047,11 @@
             <w:tcW w:w="0" w:type="auto"/>
           </w:tcPr>
           <w:p>
+            <w:proofErr w:type="spellStart"/>
             <w:r>
               <w:t>Title_settings</w:t>
             </w:r>
+            <w:proofErr w:type="spellEnd"/>
           </w:p>
         </w:tc>
         <w:tc>
@@ -3036,9 +3116,11 @@
             <w:tcW w:w="0" w:type="auto"/>
           </w:tcPr>
           <w:p>
+            <w:proofErr w:type="spellStart"/>
             <w:r>
               <w:t>Title_game</w:t>
             </w:r>
+            <w:proofErr w:type="spellEnd"/>
           </w:p>
         </w:tc>
         <w:tc>
@@ -3112,9 +3194,11 @@
             <w:tcW w:w="0" w:type="auto"/>
           </w:tcPr>
           <w:p>
+            <w:proofErr w:type="spellStart"/>
             <w:r>
               <w:t>Button_forgotPassword</w:t>
             </w:r>
+            <w:proofErr w:type="spellEnd"/>
           </w:p>
         </w:tc>
         <w:tc>
@@ -3179,9 +3263,11 @@
             <w:tcW w:w="0" w:type="auto"/>
           </w:tcPr>
           <w:p>
+            <w:proofErr w:type="spellStart"/>
             <w:r>
               <w:t>Button_profile</w:t>
             </w:r>
+            <w:proofErr w:type="spellEnd"/>
           </w:p>
         </w:tc>
         <w:tc>
@@ -3243,9 +3329,11 @@
             <w:tcW w:w="0" w:type="auto"/>
           </w:tcPr>
           <w:p>
+            <w:proofErr w:type="spellStart"/>
             <w:r>
               <w:t>Title_matchSettings</w:t>
             </w:r>
+            <w:proofErr w:type="spellEnd"/>
           </w:p>
         </w:tc>
         <w:tc>
@@ -3310,9 +3398,11 @@
             <w:tcW w:w="0" w:type="auto"/>
           </w:tcPr>
           <w:p>
+            <w:proofErr w:type="spellStart"/>
             <w:r>
               <w:t>Button_editProfile</w:t>
             </w:r>
+            <w:proofErr w:type="spellEnd"/>
           </w:p>
         </w:tc>
         <w:tc>
@@ -3390,9 +3480,11 @@
             <w:tcW w:w="0" w:type="auto"/>
           </w:tcPr>
           <w:p>
+            <w:proofErr w:type="spellStart"/>
             <w:r>
               <w:t>Button_goBack</w:t>
             </w:r>
+            <w:proofErr w:type="spellEnd"/>
           </w:p>
         </w:tc>
         <w:tc>
@@ -3464,6 +3556,7 @@
             <w:tcW w:w="0" w:type="auto"/>
           </w:tcPr>
           <w:p>
+            <w:proofErr w:type="spellStart"/>
             <w:r>
               <w:t>Message_succes</w:t>
             </w:r>
@@ -3473,6 +3566,7 @@
             <w:r>
               <w:t>SignUp</w:t>
             </w:r>
+            <w:proofErr w:type="spellEnd"/>
           </w:p>
         </w:tc>
         <w:tc>
@@ -3543,9 +3637,11 @@
             <w:tcW w:w="0" w:type="auto"/>
           </w:tcPr>
           <w:p>
+            <w:proofErr w:type="spellStart"/>
             <w:r>
               <w:t>Message_confirmGoBack</w:t>
             </w:r>
+            <w:proofErr w:type="spellEnd"/>
           </w:p>
         </w:tc>
         <w:tc>
@@ -3656,9 +3752,11 @@
             <w:tcW w:w="0" w:type="auto"/>
           </w:tcPr>
           <w:p>
+            <w:proofErr w:type="spellStart"/>
             <w:r>
               <w:t>Button_yes</w:t>
             </w:r>
+            <w:proofErr w:type="spellEnd"/>
           </w:p>
         </w:tc>
         <w:tc>
@@ -3720,9 +3818,11 @@
             <w:tcW w:w="0" w:type="auto"/>
           </w:tcPr>
           <w:p>
+            <w:proofErr w:type="spellStart"/>
             <w:r>
               <w:t>Button_no</w:t>
             </w:r>
+            <w:proofErr w:type="spellEnd"/>
           </w:p>
         </w:tc>
         <w:tc>
@@ -3787,9 +3887,11 @@
             <w:tcW w:w="0" w:type="auto"/>
           </w:tcPr>
           <w:p>
+            <w:proofErr w:type="spellStart"/>
             <w:r>
               <w:t>Message_emailInUse</w:t>
             </w:r>
+            <w:proofErr w:type="spellEnd"/>
           </w:p>
         </w:tc>
         <w:tc>
@@ -3869,12 +3971,14 @@
             <w:tcW w:w="0" w:type="auto"/>
           </w:tcPr>
           <w:p>
+            <w:proofErr w:type="spellStart"/>
             <w:r>
               <w:t>Error_</w:t>
             </w:r>
             <w:r>
               <w:t>signUpFailed</w:t>
             </w:r>
+            <w:proofErr w:type="spellEnd"/>
           </w:p>
         </w:tc>
         <w:tc>
@@ -4001,6 +4105,7 @@
             <w:tcW w:w="0" w:type="auto"/>
           </w:tcPr>
           <w:p>
+            <w:proofErr w:type="spellStart"/>
             <w:r>
               <w:t>Error_</w:t>
             </w:r>
@@ -4010,6 +4115,7 @@
             <w:r>
               <w:t>gInFailed</w:t>
             </w:r>
+            <w:proofErr w:type="spellEnd"/>
           </w:p>
         </w:tc>
         <w:tc>
@@ -4097,9 +4203,11 @@
             <w:tcW w:w="0" w:type="auto"/>
           </w:tcPr>
           <w:p>
+            <w:proofErr w:type="spellStart"/>
             <w:r>
               <w:t>Message_emailCode</w:t>
             </w:r>
+            <w:proofErr w:type="spellEnd"/>
           </w:p>
         </w:tc>
         <w:tc>
@@ -4181,9 +4289,11 @@
             <w:tcW w:w="0" w:type="auto"/>
           </w:tcPr>
           <w:p>
+            <w:proofErr w:type="spellStart"/>
             <w:r>
               <w:t>Message_inputCode</w:t>
             </w:r>
+            <w:proofErr w:type="spellEnd"/>
           </w:p>
         </w:tc>
         <w:tc>
@@ -4245,9 +4355,11 @@
             <w:tcW w:w="0" w:type="auto"/>
           </w:tcPr>
           <w:p>
+            <w:proofErr w:type="spellStart"/>
             <w:r>
               <w:t>Text_newPassword</w:t>
             </w:r>
+            <w:proofErr w:type="spellEnd"/>
           </w:p>
         </w:tc>
         <w:tc>
@@ -4312,9 +4424,11 @@
             <w:tcW w:w="0" w:type="auto"/>
           </w:tcPr>
           <w:p>
+            <w:proofErr w:type="spellStart"/>
             <w:r>
               <w:t>Button_continue</w:t>
             </w:r>
+            <w:proofErr w:type="spellEnd"/>
           </w:p>
         </w:tc>
         <w:tc>
@@ -4376,9 +4490,11 @@
             <w:tcW w:w="0" w:type="auto"/>
           </w:tcPr>
           <w:p>
+            <w:proofErr w:type="spellStart"/>
             <w:r>
               <w:t>Message_passwordUpdate</w:t>
             </w:r>
+            <w:proofErr w:type="spellEnd"/>
           </w:p>
         </w:tc>
         <w:tc>
@@ -4449,9 +4565,11 @@
             <w:tcW w:w="0" w:type="auto"/>
           </w:tcPr>
           <w:p>
+            <w:proofErr w:type="spellStart"/>
             <w:r>
               <w:t>Error_invalidCode</w:t>
             </w:r>
+            <w:proofErr w:type="spellEnd"/>
           </w:p>
         </w:tc>
         <w:tc>
@@ -4555,6 +4673,7 @@
             <w:tcW w:w="0" w:type="auto"/>
           </w:tcPr>
           <w:p>
+            <w:proofErr w:type="spellStart"/>
             <w:r>
               <w:t>Error</w:t>
             </w:r>
@@ -4570,6 +4689,7 @@
             <w:r>
               <w:t>DontMatch</w:t>
             </w:r>
+            <w:proofErr w:type="spellEnd"/>
           </w:p>
         </w:tc>
         <w:tc>
@@ -4648,6 +4768,7 @@
             <w:tcW w:w="0" w:type="auto"/>
           </w:tcPr>
           <w:p>
+            <w:proofErr w:type="spellStart"/>
             <w:r>
               <w:t>Error_</w:t>
             </w:r>
@@ -4657,6 +4778,7 @@
             <w:r>
               <w:t>ed</w:t>
             </w:r>
+            <w:proofErr w:type="spellEnd"/>
           </w:p>
         </w:tc>
         <w:tc>
@@ -4743,9 +4865,11 @@
             <w:tcW w:w="0" w:type="auto"/>
           </w:tcPr>
           <w:p>
+            <w:proofErr w:type="spellStart"/>
             <w:r>
               <w:t>Button_resendCode</w:t>
             </w:r>
+            <w:proofErr w:type="spellEnd"/>
           </w:p>
         </w:tc>
         <w:tc>
@@ -4816,12 +4940,14 @@
             <w:tcW w:w="0" w:type="auto"/>
           </w:tcPr>
           <w:p>
+            <w:proofErr w:type="spellStart"/>
             <w:r>
               <w:t>Text_total</w:t>
             </w:r>
             <w:r>
               <w:t>Wins</w:t>
             </w:r>
+            <w:proofErr w:type="spellEnd"/>
           </w:p>
         </w:tc>
         <w:tc>
@@ -4889,12 +5015,14 @@
             <w:tcW w:w="0" w:type="auto"/>
           </w:tcPr>
           <w:p>
+            <w:proofErr w:type="spellStart"/>
             <w:r>
               <w:t>Text_</w:t>
             </w:r>
             <w:r>
               <w:t>losses</w:t>
             </w:r>
+            <w:proofErr w:type="spellEnd"/>
           </w:p>
         </w:tc>
         <w:tc>
@@ -4959,9 +5087,11 @@
             <w:tcW w:w="0" w:type="auto"/>
           </w:tcPr>
           <w:p>
+            <w:proofErr w:type="spellStart"/>
             <w:r>
               <w:t>Text_winPercentage</w:t>
             </w:r>
+            <w:proofErr w:type="spellEnd"/>
           </w:p>
         </w:tc>
         <w:tc>
@@ -5023,9 +5153,11 @@
             <w:tcW w:w="0" w:type="auto"/>
           </w:tcPr>
           <w:p>
+            <w:proofErr w:type="spellStart"/>
             <w:r>
               <w:t>Text_profilePic</w:t>
             </w:r>
+            <w:proofErr w:type="spellEnd"/>
           </w:p>
         </w:tc>
         <w:tc>
@@ -5090,9 +5222,11 @@
             <w:tcW w:w="0" w:type="auto"/>
           </w:tcPr>
           <w:p>
+            <w:proofErr w:type="spellStart"/>
             <w:r>
               <w:t>Button_deleteAccount</w:t>
             </w:r>
+            <w:proofErr w:type="spellEnd"/>
           </w:p>
         </w:tc>
         <w:tc>
@@ -5167,9 +5301,11 @@
             <w:tcW w:w="0" w:type="auto"/>
           </w:tcPr>
           <w:p>
+            <w:proofErr w:type="spellStart"/>
             <w:r>
               <w:t>Button_update</w:t>
             </w:r>
+            <w:proofErr w:type="spellEnd"/>
           </w:p>
         </w:tc>
         <w:tc>
@@ -5234,9 +5370,11 @@
             <w:tcW w:w="0" w:type="auto"/>
           </w:tcPr>
           <w:p>
+            <w:proofErr w:type="spellStart"/>
             <w:r>
               <w:t>Message_updateSuccess</w:t>
             </w:r>
+            <w:proofErr w:type="spellEnd"/>
           </w:p>
         </w:tc>
         <w:tc>
@@ -5310,9 +5448,11 @@
             <w:tcW w:w="0" w:type="auto"/>
           </w:tcPr>
           <w:p>
+            <w:proofErr w:type="spellStart"/>
             <w:r>
               <w:t>Message_sameData</w:t>
             </w:r>
+            <w:proofErr w:type="spellEnd"/>
           </w:p>
         </w:tc>
         <w:tc>
@@ -5389,9 +5529,11 @@
             <w:tcW w:w="0" w:type="auto"/>
           </w:tcPr>
           <w:p>
+            <w:proofErr w:type="spellStart"/>
             <w:r>
               <w:t>Button_selectFile</w:t>
             </w:r>
+            <w:proofErr w:type="spellEnd"/>
           </w:p>
         </w:tc>
         <w:tc>
@@ -5466,9 +5608,11 @@
             <w:tcW w:w="0" w:type="auto"/>
           </w:tcPr>
           <w:p>
+            <w:proofErr w:type="spellStart"/>
             <w:r>
               <w:t>Button_search</w:t>
             </w:r>
+            <w:proofErr w:type="spellEnd"/>
           </w:p>
         </w:tc>
         <w:tc>
@@ -5533,9 +5677,11 @@
             <w:tcW w:w="0" w:type="auto"/>
           </w:tcPr>
           <w:p>
+            <w:proofErr w:type="spellStart"/>
             <w:r>
               <w:t>Button_confirm</w:t>
             </w:r>
+            <w:proofErr w:type="spellEnd"/>
           </w:p>
         </w:tc>
         <w:tc>
@@ -5604,9 +5750,11 @@
             <w:tcW w:w="0" w:type="auto"/>
           </w:tcPr>
           <w:p>
+            <w:proofErr w:type="spellStart"/>
             <w:r>
               <w:t>Text_selectCategory</w:t>
             </w:r>
+            <w:proofErr w:type="spellEnd"/>
           </w:p>
         </w:tc>
         <w:tc>
@@ -5685,10 +5833,12 @@
             <w:tcW w:w="0" w:type="auto"/>
           </w:tcPr>
           <w:p>
+            <w:proofErr w:type="spellStart"/>
             <w:r>
               <w:lastRenderedPageBreak/>
               <w:t>Text_catAnimals</w:t>
             </w:r>
+            <w:proofErr w:type="spellEnd"/>
           </w:p>
         </w:tc>
         <w:tc>
@@ -5750,9 +5900,11 @@
             <w:tcW w:w="0" w:type="auto"/>
           </w:tcPr>
           <w:p>
+            <w:proofErr w:type="spellStart"/>
             <w:r>
               <w:t>Text_catFruits</w:t>
             </w:r>
+            <w:proofErr w:type="spellEnd"/>
           </w:p>
         </w:tc>
         <w:tc>
@@ -5824,9 +5976,11 @@
             <w:tcW w:w="0" w:type="auto"/>
           </w:tcPr>
           <w:p>
+            <w:proofErr w:type="spellStart"/>
             <w:r>
               <w:t>Text_catColors</w:t>
             </w:r>
+            <w:proofErr w:type="spellEnd"/>
           </w:p>
         </w:tc>
         <w:tc>
@@ -5888,9 +6042,11 @@
             <w:tcW w:w="0" w:type="auto"/>
           </w:tcPr>
           <w:p>
+            <w:proofErr w:type="spellStart"/>
             <w:r>
               <w:t>Text_catObjects</w:t>
             </w:r>
+            <w:proofErr w:type="spellEnd"/>
           </w:p>
         </w:tc>
         <w:tc>
@@ -5955,9 +6111,11 @@
             <w:tcW w:w="0" w:type="auto"/>
           </w:tcPr>
           <w:p>
+            <w:proofErr w:type="spellStart"/>
             <w:r>
               <w:t>Text_catCountries</w:t>
             </w:r>
+            <w:proofErr w:type="spellEnd"/>
           </w:p>
         </w:tc>
         <w:tc>
@@ -6026,9 +6184,11 @@
             <w:tcW w:w="0" w:type="auto"/>
           </w:tcPr>
           <w:p>
+            <w:proofErr w:type="spellStart"/>
             <w:r>
               <w:t>Text_selectWord</w:t>
             </w:r>
+            <w:proofErr w:type="spellEnd"/>
           </w:p>
         </w:tc>
         <w:tc>
@@ -6093,12 +6253,14 @@
             <w:tcW w:w="0" w:type="auto"/>
           </w:tcPr>
           <w:p>
+            <w:proofErr w:type="spellStart"/>
             <w:r>
               <w:t>Text_</w:t>
             </w:r>
             <w:r>
               <w:t>writeYourOwn</w:t>
             </w:r>
+            <w:proofErr w:type="spellEnd"/>
           </w:p>
         </w:tc>
         <w:tc>
@@ -6172,9 +6334,11 @@
             <w:tcW w:w="0" w:type="auto"/>
           </w:tcPr>
           <w:p>
+            <w:proofErr w:type="spellStart"/>
             <w:r>
               <w:t>Text_writeWord</w:t>
             </w:r>
+            <w:proofErr w:type="spellEnd"/>
           </w:p>
         </w:tc>
         <w:tc>
@@ -6245,9 +6409,11 @@
             <w:tcW w:w="0" w:type="auto"/>
           </w:tcPr>
           <w:p>
+            <w:proofErr w:type="spellStart"/>
             <w:r>
               <w:t>Button_create</w:t>
             </w:r>
+            <w:proofErr w:type="spellEnd"/>
           </w:p>
         </w:tc>
         <w:tc>
@@ -6309,9 +6475,11 @@
             <w:tcW w:w="0" w:type="auto"/>
           </w:tcPr>
           <w:p>
+            <w:proofErr w:type="spellStart"/>
             <w:r>
               <w:t>Message_creationSuccess</w:t>
             </w:r>
+            <w:proofErr w:type="spellEnd"/>
           </w:p>
         </w:tc>
         <w:tc>
@@ -6388,9 +6556,11 @@
             <w:tcW w:w="0" w:type="auto"/>
           </w:tcPr>
           <w:p>
+            <w:proofErr w:type="spellStart"/>
             <w:r>
               <w:t>Button_matchSettings</w:t>
             </w:r>
+            <w:proofErr w:type="spellEnd"/>
           </w:p>
         </w:tc>
         <w:tc>
@@ -6452,9 +6622,11 @@
             <w:tcW w:w="0" w:type="auto"/>
           </w:tcPr>
           <w:p>
+            <w:proofErr w:type="spellStart"/>
             <w:r>
               <w:t>Button_leaveMatch</w:t>
             </w:r>
+            <w:proofErr w:type="spellEnd"/>
           </w:p>
         </w:tc>
         <w:tc>
@@ -6519,9 +6691,11 @@
             <w:tcW w:w="0" w:type="auto"/>
           </w:tcPr>
           <w:p>
+            <w:proofErr w:type="spellStart"/>
             <w:r>
               <w:t>Button_startMatch</w:t>
             </w:r>
+            <w:proofErr w:type="spellEnd"/>
           </w:p>
         </w:tc>
         <w:tc>
@@ -6583,9 +6757,11 @@
             <w:tcW w:w="0" w:type="auto"/>
           </w:tcPr>
           <w:p>
+            <w:proofErr w:type="spellStart"/>
             <w:r>
               <w:t>Error_connectionEnded</w:t>
             </w:r>
+            <w:proofErr w:type="spellEnd"/>
           </w:p>
         </w:tc>
         <w:tc>
@@ -6668,9 +6844,11 @@
             <w:tcW w:w="0" w:type="auto"/>
           </w:tcPr>
           <w:p>
+            <w:proofErr w:type="spellStart"/>
             <w:r>
               <w:t>Text_chatPrompt</w:t>
             </w:r>
+            <w:proofErr w:type="spellEnd"/>
           </w:p>
         </w:tc>
         <w:tc>
@@ -6738,9 +6916,11 @@
             <w:tcW w:w="0" w:type="auto"/>
           </w:tcPr>
           <w:p>
+            <w:proofErr w:type="spellStart"/>
             <w:r>
               <w:t>Button_saveSettings</w:t>
             </w:r>
+            <w:proofErr w:type="spellEnd"/>
           </w:p>
         </w:tc>
         <w:tc>
@@ -6803,9 +6983,11 @@
             <w:tcW w:w="0" w:type="auto"/>
           </w:tcPr>
           <w:p>
+            <w:proofErr w:type="spellStart"/>
             <w:r>
               <w:t>Button_kickPlayer</w:t>
             </w:r>
+            <w:proofErr w:type="spellEnd"/>
           </w:p>
         </w:tc>
         <w:tc>
@@ -6867,9 +7049,11 @@
             <w:tcW w:w="0" w:type="auto"/>
           </w:tcPr>
           <w:p>
+            <w:proofErr w:type="spellStart"/>
             <w:r>
               <w:t>Message_wordChange</w:t>
             </w:r>
+            <w:proofErr w:type="spellEnd"/>
           </w:p>
         </w:tc>
         <w:tc>
@@ -6941,12 +7125,14 @@
             <w:tcW w:w="0" w:type="auto"/>
           </w:tcPr>
           <w:p>
+            <w:proofErr w:type="spellStart"/>
             <w:r>
               <w:t>Message_</w:t>
             </w:r>
             <w:r>
               <w:t>backNoSave</w:t>
             </w:r>
+            <w:proofErr w:type="spellEnd"/>
           </w:p>
         </w:tc>
         <w:tc>
@@ -7072,9 +7258,11 @@
             <w:tcW w:w="0" w:type="auto"/>
           </w:tcPr>
           <w:p>
+            <w:proofErr w:type="spellStart"/>
             <w:r>
               <w:t>Text_you</w:t>
             </w:r>
+            <w:proofErr w:type="spellEnd"/>
           </w:p>
         </w:tc>
         <w:tc>
@@ -7139,9 +7327,11 @@
             <w:tcW w:w="0" w:type="auto"/>
           </w:tcPr>
           <w:p>
+            <w:proofErr w:type="spellStart"/>
             <w:r>
               <w:t>Text_awaitingOpponent</w:t>
             </w:r>
+            <w:proofErr w:type="spellEnd"/>
           </w:p>
         </w:tc>
         <w:tc>
@@ -7203,10 +7393,12 @@
             <w:tcW w:w="0" w:type="auto"/>
           </w:tcPr>
           <w:p>
+            <w:proofErr w:type="spellStart"/>
             <w:r>
               <w:lastRenderedPageBreak/>
               <w:t>Text_availableMatches</w:t>
             </w:r>
+            <w:proofErr w:type="spellEnd"/>
           </w:p>
         </w:tc>
         <w:tc>
@@ -7278,9 +7470,11 @@
             <w:tcW w:w="0" w:type="auto"/>
           </w:tcPr>
           <w:p>
+            <w:proofErr w:type="spellStart"/>
             <w:r>
               <w:t>Button_viewProfile</w:t>
             </w:r>
+            <w:proofErr w:type="spellEnd"/>
           </w:p>
         </w:tc>
         <w:tc>
@@ -7342,9 +7536,11 @@
             <w:tcW w:w="0" w:type="auto"/>
           </w:tcPr>
           <w:p>
+            <w:proofErr w:type="spellStart"/>
             <w:r>
               <w:t>Text_created</w:t>
             </w:r>
+            <w:proofErr w:type="spellEnd"/>
           </w:p>
         </w:tc>
         <w:tc>
@@ -7415,12 +7611,14 @@
             <w:tcW w:w="0" w:type="auto"/>
           </w:tcPr>
           <w:p>
+            <w:proofErr w:type="spellStart"/>
             <w:r>
               <w:t>Text</w:t>
             </w:r>
             <w:r>
               <w:t>_today</w:t>
             </w:r>
+            <w:proofErr w:type="spellEnd"/>
           </w:p>
         </w:tc>
         <w:tc>
@@ -7482,9 +7680,11 @@
             <w:tcW w:w="0" w:type="auto"/>
           </w:tcPr>
           <w:p>
+            <w:proofErr w:type="spellStart"/>
             <w:r>
               <w:t>Text_awaitingStart</w:t>
             </w:r>
+            <w:proofErr w:type="spellEnd"/>
           </w:p>
         </w:tc>
         <w:tc>
@@ -7515,7 +7715,15 @@
               <w:cnfStyle w:val="000000000000" w:firstRow="0" w:lastRow="0" w:firstColumn="0" w:lastColumn="0" w:oddVBand="0" w:evenVBand="0" w:oddHBand="0" w:evenHBand="0" w:firstRowFirstColumn="0" w:firstRowLastColumn="0" w:lastRowFirstColumn="0" w:lastRowLastColumn="0"/>
             </w:pPr>
             <w:r>
-              <w:t>Esperando a que {username} comience la partida</w:t>
+              <w:t>Esperando a que {</w:t>
+            </w:r>
+            <w:proofErr w:type="spellStart"/>
+            <w:r>
+              <w:t>username</w:t>
+            </w:r>
+            <w:proofErr w:type="spellEnd"/>
+            <w:r>
+              <w:t>} comience la partida</w:t>
             </w:r>
           </w:p>
         </w:tc>
@@ -7549,9 +7757,11 @@
             <w:tcW w:w="0" w:type="auto"/>
           </w:tcPr>
           <w:p>
+            <w:proofErr w:type="spellStart"/>
             <w:r>
               <w:t>Text_playerJoined</w:t>
             </w:r>
+            <w:proofErr w:type="spellEnd"/>
           </w:p>
         </w:tc>
         <w:tc>
@@ -7582,7 +7792,15 @@
               <w:cnfStyle w:val="000000100000" w:firstRow="0" w:lastRow="0" w:firstColumn="0" w:lastColumn="0" w:oddVBand="0" w:evenVBand="0" w:oddHBand="1" w:evenHBand="0" w:firstRowFirstColumn="0" w:firstRowLastColumn="0" w:lastRowFirstColumn="0" w:lastRowLastColumn="0"/>
             </w:pPr>
             <w:r>
-              <w:t>{username} se ha unido a la partida</w:t>
+              <w:t>{</w:t>
+            </w:r>
+            <w:proofErr w:type="spellStart"/>
+            <w:r>
+              <w:t>username</w:t>
+            </w:r>
+            <w:proofErr w:type="spellEnd"/>
+            <w:r>
+              <w:t>} se ha unido a la partida</w:t>
             </w:r>
           </w:p>
         </w:tc>
@@ -7613,9 +7831,11 @@
             <w:tcW w:w="0" w:type="auto"/>
           </w:tcPr>
           <w:p>
+            <w:proofErr w:type="spellStart"/>
             <w:r>
               <w:t>Text_rightGuess</w:t>
             </w:r>
+            <w:proofErr w:type="spellEnd"/>
           </w:p>
         </w:tc>
         <w:tc>
@@ -7680,9 +7900,11 @@
             <w:tcW w:w="0" w:type="auto"/>
           </w:tcPr>
           <w:p>
+            <w:proofErr w:type="spellStart"/>
             <w:r>
               <w:t>Text_wrongGuess</w:t>
             </w:r>
+            <w:proofErr w:type="spellEnd"/>
           </w:p>
         </w:tc>
         <w:tc>
@@ -7736,12 +7958,14 @@
             <w:r>
               <w:t xml:space="preserve"> Te quedan {</w:t>
             </w:r>
+            <w:proofErr w:type="spellStart"/>
             <w:r>
               <w:t>a</w:t>
             </w:r>
             <w:r>
               <w:t>ttempts</w:t>
             </w:r>
+            <w:proofErr w:type="spellEnd"/>
             <w:r>
               <w:t xml:space="preserve">} </w:t>
             </w:r>
@@ -7802,9 +8026,11 @@
             <w:tcW w:w="0" w:type="auto"/>
           </w:tcPr>
           <w:p>
+            <w:proofErr w:type="spellStart"/>
             <w:r>
               <w:t>Message_confirmLeave</w:t>
             </w:r>
+            <w:proofErr w:type="spellEnd"/>
           </w:p>
         </w:tc>
         <w:tc>
@@ -7869,9 +8095,11 @@
             <w:tcW w:w="0" w:type="auto"/>
           </w:tcPr>
           <w:p>
+            <w:proofErr w:type="spellStart"/>
             <w:r>
               <w:t>Append_noPenalization</w:t>
             </w:r>
+            <w:proofErr w:type="spellEnd"/>
           </w:p>
         </w:tc>
         <w:tc>
@@ -7951,9 +8179,11 @@
             <w:tcW w:w="0" w:type="auto"/>
           </w:tcPr>
           <w:p>
+            <w:proofErr w:type="spellStart"/>
             <w:r>
               <w:t>Text_playerLeft</w:t>
             </w:r>
+            <w:proofErr w:type="spellEnd"/>
           </w:p>
         </w:tc>
         <w:tc>
@@ -7984,7 +8214,15 @@
               <w:cnfStyle w:val="000000000000" w:firstRow="0" w:lastRow="0" w:firstColumn="0" w:lastColumn="0" w:oddVBand="0" w:evenVBand="0" w:oddHBand="0" w:evenHBand="0" w:firstRowFirstColumn="0" w:firstRowLastColumn="0" w:lastRowFirstColumn="0" w:lastRowLastColumn="0"/>
             </w:pPr>
             <w:r>
-              <w:t>{username} ha abandonado la partida</w:t>
+              <w:t>{</w:t>
+            </w:r>
+            <w:proofErr w:type="spellStart"/>
+            <w:r>
+              <w:t>username</w:t>
+            </w:r>
+            <w:proofErr w:type="spellEnd"/>
+            <w:r>
+              <w:t>} ha abandonado la partida</w:t>
             </w:r>
           </w:p>
         </w:tc>
@@ -8018,9 +8256,11 @@
             <w:tcW w:w="0" w:type="auto"/>
           </w:tcPr>
           <w:p>
+            <w:proofErr w:type="spellStart"/>
             <w:r>
               <w:t>Message_hostLeft</w:t>
             </w:r>
+            <w:proofErr w:type="spellEnd"/>
           </w:p>
         </w:tc>
         <w:tc>
@@ -8082,9 +8322,11 @@
             <w:tcW w:w="0" w:type="auto"/>
           </w:tcPr>
           <w:p>
+            <w:proofErr w:type="spellStart"/>
             <w:r>
               <w:t>Append_penalization</w:t>
             </w:r>
+            <w:proofErr w:type="spellEnd"/>
           </w:p>
         </w:tc>
         <w:tc>
@@ -8167,12 +8409,14 @@
             <w:tcW w:w="0" w:type="auto"/>
           </w:tcPr>
           <w:p>
+            <w:proofErr w:type="spellStart"/>
             <w:r>
               <w:t>Message</w:t>
             </w:r>
             <w:r>
               <w:t>_youLeft</w:t>
             </w:r>
+            <w:proofErr w:type="spellEnd"/>
           </w:p>
         </w:tc>
         <w:tc>
@@ -8240,12 +8484,14 @@
             <w:tcW w:w="0" w:type="auto"/>
           </w:tcPr>
           <w:p>
+            <w:proofErr w:type="spellStart"/>
             <w:r>
               <w:t>Message</w:t>
             </w:r>
             <w:r>
               <w:t>_opponentLeft</w:t>
             </w:r>
+            <w:proofErr w:type="spellEnd"/>
           </w:p>
         </w:tc>
         <w:tc>
@@ -8342,9 +8588,11 @@
             <w:tcW w:w="0" w:type="auto"/>
           </w:tcPr>
           <w:p>
+            <w:proofErr w:type="spellStart"/>
             <w:r>
               <w:t>Message_confirmKick</w:t>
             </w:r>
+            <w:proofErr w:type="spellEnd"/>
           </w:p>
         </w:tc>
         <w:tc>
@@ -8471,10 +8719,12 @@
             <w:tcW w:w="0" w:type="auto"/>
           </w:tcPr>
           <w:p>
+            <w:proofErr w:type="spellStart"/>
             <w:r>
               <w:lastRenderedPageBreak/>
               <w:t>Message_gotKicked</w:t>
             </w:r>
+            <w:proofErr w:type="spellEnd"/>
           </w:p>
         </w:tc>
         <w:tc>
@@ -8560,9 +8810,11 @@
             <w:tcW w:w="0" w:type="auto"/>
           </w:tcPr>
           <w:p>
+            <w:proofErr w:type="spellStart"/>
             <w:r>
               <w:t>Append_pointsLost</w:t>
             </w:r>
+            <w:proofErr w:type="spellEnd"/>
           </w:p>
         </w:tc>
         <w:tc>
@@ -8624,9 +8876,11 @@
             <w:tcW w:w="0" w:type="auto"/>
           </w:tcPr>
           <w:p>
+            <w:proofErr w:type="spellStart"/>
             <w:r>
               <w:t>Message_kickedPlayer</w:t>
             </w:r>
+            <w:proofErr w:type="spellEnd"/>
           </w:p>
         </w:tc>
         <w:tc>
@@ -8657,7 +8911,15 @@
               <w:cnfStyle w:val="000000000000" w:firstRow="0" w:lastRow="0" w:firstColumn="0" w:lastColumn="0" w:oddVBand="0" w:evenVBand="0" w:oddHBand="0" w:evenHBand="0" w:firstRowFirstColumn="0" w:firstRowLastColumn="0" w:lastRowFirstColumn="0" w:lastRowLastColumn="0"/>
             </w:pPr>
             <w:r>
-              <w:t>Expulsaste a {username}</w:t>
+              <w:t>Expulsaste a {</w:t>
+            </w:r>
+            <w:proofErr w:type="spellStart"/>
+            <w:r>
+              <w:t>username</w:t>
+            </w:r>
+            <w:proofErr w:type="spellEnd"/>
+            <w:r>
+              <w:t>}</w:t>
             </w:r>
           </w:p>
         </w:tc>
@@ -8709,12 +8971,14 @@
             <w:tcW w:w="0" w:type="auto"/>
           </w:tcPr>
           <w:p>
+            <w:proofErr w:type="spellStart"/>
             <w:r>
               <w:t>Message</w:t>
             </w:r>
             <w:r>
               <w:t>_kickedMidGame</w:t>
             </w:r>
+            <w:proofErr w:type="spellEnd"/>
           </w:p>
         </w:tc>
         <w:tc>
@@ -8794,9 +9058,11 @@
             <w:tcW w:w="0" w:type="auto"/>
           </w:tcPr>
           <w:p>
+            <w:proofErr w:type="spellStart"/>
             <w:r>
               <w:t>Append_noPointsLost</w:t>
             </w:r>
+            <w:proofErr w:type="spellEnd"/>
           </w:p>
         </w:tc>
         <w:tc>
@@ -8869,12 +9135,14 @@
             <w:tcW w:w="0" w:type="auto"/>
           </w:tcPr>
           <w:p>
+            <w:proofErr w:type="spellStart"/>
             <w:r>
               <w:t>Message_</w:t>
             </w:r>
             <w:r>
               <w:t>wordGuessed</w:t>
             </w:r>
+            <w:proofErr w:type="spellEnd"/>
           </w:p>
         </w:tc>
         <w:tc>
@@ -8974,9 +9242,11 @@
             <w:tcW w:w="0" w:type="auto"/>
           </w:tcPr>
           <w:p>
+            <w:proofErr w:type="spellStart"/>
             <w:r>
               <w:t>Message_opponentWon</w:t>
             </w:r>
+            <w:proofErr w:type="spellEnd"/>
           </w:p>
         </w:tc>
         <w:tc>
@@ -9007,7 +9277,15 @@
               <w:cnfStyle w:val="000000000000" w:firstRow="0" w:lastRow="0" w:firstColumn="0" w:lastColumn="0" w:oddVBand="0" w:evenVBand="0" w:oddHBand="0" w:evenHBand="0" w:firstRowFirstColumn="0" w:firstRowLastColumn="0" w:lastRowFirstColumn="0" w:lastRowLastColumn="0"/>
             </w:pPr>
             <w:r>
-              <w:t>{username} adivinó tu palabra. ¡Suerte para la próxima!</w:t>
+              <w:t>{</w:t>
+            </w:r>
+            <w:proofErr w:type="spellStart"/>
+            <w:r>
+              <w:t>username</w:t>
+            </w:r>
+            <w:proofErr w:type="spellEnd"/>
+            <w:r>
+              <w:t>} adivinó tu palabra. ¡Suerte para la próxima!</w:t>
             </w:r>
           </w:p>
         </w:tc>
@@ -9048,9 +9326,11 @@
             <w:tcW w:w="0" w:type="auto"/>
           </w:tcPr>
           <w:p>
+            <w:proofErr w:type="spellStart"/>
             <w:r>
               <w:t>Message_wordNotGuessed</w:t>
             </w:r>
+            <w:proofErr w:type="spellEnd"/>
           </w:p>
         </w:tc>
         <w:tc>
@@ -9150,9 +9430,11 @@
             <w:tcW w:w="0" w:type="auto"/>
           </w:tcPr>
           <w:p>
+            <w:proofErr w:type="spellStart"/>
             <w:r>
               <w:t>Message_opponentLost</w:t>
             </w:r>
+            <w:proofErr w:type="spellEnd"/>
           </w:p>
         </w:tc>
         <w:tc>
@@ -9183,7 +9465,15 @@
               <w:cnfStyle w:val="000000000000" w:firstRow="0" w:lastRow="0" w:firstColumn="0" w:lastColumn="0" w:oddVBand="0" w:evenVBand="0" w:oddHBand="0" w:evenHBand="0" w:firstRowFirstColumn="0" w:firstRowLastColumn="0" w:lastRowFirstColumn="0" w:lastRowLastColumn="0"/>
             </w:pPr>
             <w:r>
-              <w:t>¡Felicidades! {username} no adivinó tu palabra. Ganaste 5 puntos</w:t>
+              <w:t>¡Felicidades! {</w:t>
+            </w:r>
+            <w:proofErr w:type="spellStart"/>
+            <w:r>
+              <w:t>username</w:t>
+            </w:r>
+            <w:proofErr w:type="spellEnd"/>
+            <w:r>
+              <w:t>} no adivinó tu palabra. Ganaste 5 puntos</w:t>
             </w:r>
           </w:p>
         </w:tc>
@@ -9232,12 +9522,14 @@
             <w:tcW w:w="0" w:type="auto"/>
           </w:tcPr>
           <w:p>
+            <w:proofErr w:type="spellStart"/>
             <w:r>
               <w:t>Error_</w:t>
             </w:r>
             <w:r>
               <w:t>scoresUpdFailed</w:t>
             </w:r>
+            <w:proofErr w:type="spellEnd"/>
           </w:p>
         </w:tc>
         <w:tc>
@@ -9318,6 +9610,7 @@
             <w:tcW w:w="0" w:type="auto"/>
           </w:tcPr>
           <w:p>
+            <w:proofErr w:type="spellStart"/>
             <w:r>
               <w:lastRenderedPageBreak/>
               <w:t>Error_</w:t>
@@ -9325,6 +9618,7 @@
             <w:r>
               <w:t>messageNotSent</w:t>
             </w:r>
+            <w:proofErr w:type="spellEnd"/>
           </w:p>
         </w:tc>
         <w:tc>
@@ -9401,9 +9695,11 @@
             <w:tcW w:w="0" w:type="auto"/>
           </w:tcPr>
           <w:p>
+            <w:proofErr w:type="spellStart"/>
             <w:r>
               <w:t>Text_language</w:t>
             </w:r>
+            <w:proofErr w:type="spellEnd"/>
           </w:p>
         </w:tc>
         <w:tc>
@@ -9454,6 +9750,72 @@
                 <w:lang w:val="de-DE"/>
               </w:rPr>
               <w:t>Sprache</w:t>
+            </w:r>
+          </w:p>
+        </w:tc>
+      </w:tr>
+      <w:tr>
+        <w:tc>
+          <w:tcPr>
+            <w:cnfStyle w:val="001000000000" w:firstRow="0" w:lastRow="0" w:firstColumn="1" w:lastColumn="0" w:oddVBand="0" w:evenVBand="0" w:oddHBand="0" w:evenHBand="0" w:firstRowFirstColumn="0" w:firstRowLastColumn="0" w:lastRowFirstColumn="0" w:lastRowLastColumn="0"/>
+            <w:tcW w:w="0" w:type="auto"/>
+          </w:tcPr>
+          <w:p>
+            <w:proofErr w:type="spellStart"/>
+            <w:r>
+              <w:t>Text_useSystemDefault</w:t>
+            </w:r>
+            <w:proofErr w:type="spellEnd"/>
+          </w:p>
+        </w:tc>
+        <w:tc>
+          <w:tcPr>
+            <w:tcW w:w="0" w:type="auto"/>
+          </w:tcPr>
+          <w:p>
+            <w:pPr>
+              <w:cnfStyle w:val="000000000000" w:firstRow="0" w:lastRow="0" w:firstColumn="0" w:lastColumn="0" w:oddVBand="0" w:evenVBand="0" w:oddHBand="0" w:evenHBand="0" w:firstRowFirstColumn="0" w:firstRowLastColumn="0" w:lastRowFirstColumn="0" w:lastRowLastColumn="0"/>
+              <w:rPr>
+                <w:lang w:val="en-US"/>
+              </w:rPr>
+            </w:pPr>
+            <w:r>
+              <w:rPr>
+                <w:lang w:val="en-US"/>
+              </w:rPr>
+              <w:t>Use system default</w:t>
+            </w:r>
+          </w:p>
+        </w:tc>
+        <w:tc>
+          <w:tcPr>
+            <w:tcW w:w="0" w:type="auto"/>
+          </w:tcPr>
+          <w:p>
+            <w:pPr>
+              <w:cnfStyle w:val="000000000000" w:firstRow="0" w:lastRow="0" w:firstColumn="0" w:lastColumn="0" w:oddVBand="0" w:evenVBand="0" w:oddHBand="0" w:evenHBand="0" w:firstRowFirstColumn="0" w:firstRowLastColumn="0" w:lastRowFirstColumn="0" w:lastRowLastColumn="0"/>
+            </w:pPr>
+            <w:r>
+              <w:t>Usar idioma por defecto</w:t>
+            </w:r>
+          </w:p>
+        </w:tc>
+        <w:tc>
+          <w:tcPr>
+            <w:tcW w:w="0" w:type="auto"/>
+          </w:tcPr>
+          <w:p>
+            <w:pPr>
+              <w:cnfStyle w:val="000000000000" w:firstRow="0" w:lastRow="0" w:firstColumn="0" w:lastColumn="0" w:oddVBand="0" w:evenVBand="0" w:oddHBand="0" w:evenHBand="0" w:firstRowFirstColumn="0" w:firstRowLastColumn="0" w:lastRowFirstColumn="0" w:lastRowLastColumn="0"/>
+              <w:rPr>
+                <w:lang w:val="de-DE"/>
+              </w:rPr>
+            </w:pPr>
+            <w:r>
+              <w:rPr>
+                <w:lang w:val="de-DE"/>
+              </w:rPr>
+              <w:t>Systemstandard verwenden</w:t>
             </w:r>
           </w:p>
         </w:tc>
@@ -10600,6 +10962,7 @@
                 <w:bCs w:val="0"/>
                 <w:lang w:val="en-US"/>
               </w:rPr>
+              <w:lastRenderedPageBreak/>
               <w:t>Pear</w:t>
             </w:r>
           </w:p>
@@ -10659,7 +11022,6 @@
                 <w:bCs w:val="0"/>
                 <w:lang w:val="en-US"/>
               </w:rPr>
-              <w:lastRenderedPageBreak/>
               <w:t>Pineapple</w:t>
             </w:r>
           </w:p>
@@ -12239,6 +12601,7 @@
                 <w:bCs w:val="0"/>
                 <w:lang w:val="en-US"/>
               </w:rPr>
+              <w:lastRenderedPageBreak/>
               <w:t>White</w:t>
             </w:r>
           </w:p>
@@ -12300,7 +12663,6 @@
                 <w:bCs w:val="0"/>
                 <w:lang w:val="en-US"/>
               </w:rPr>
-              <w:lastRenderedPageBreak/>
               <w:t>Black</w:t>
             </w:r>
           </w:p>
@@ -13785,6 +14147,7 @@
                 <w:bCs w:val="0"/>
                 <w:lang w:val="en-US"/>
               </w:rPr>
+              <w:lastRenderedPageBreak/>
               <w:t>Canada</w:t>
             </w:r>
           </w:p>
@@ -13844,7 +14207,6 @@
                 <w:bCs w:val="0"/>
                 <w:lang w:val="en-US"/>
               </w:rPr>
-              <w:lastRenderedPageBreak/>
               <w:t>France</w:t>
             </w:r>
           </w:p>

</xml_diff>

<commit_message>
Modify: Added Refresh string to Diccionario. Modify: Added Refresh string to Resources. Modify: Renamed CreateMatchPageViewModel to CreateMatchViewModel, updated viewmodel reference in CreateMatchPage.xaml.cs. Modify: LobbyViewModel now points to MatchesListPage in JoinMatch. Removed OpenFriends method as this feature will not be implemented. Added: MatchesListViewModel, rewired connections from MatchesListPage.xaml.cs to the viewmodel. Modify: MatchPageViewModel now inherits from BaseViewModel. Modify: MatchPage now uses its viewmodel. Modify: MatchesListPage now uses proper bindings to its viewmodel and to the Resources file for internationalization.
</commit_message>
<xml_diff>
--- a/docs/Diccionario de Traducción de Ahorcado.docx
+++ b/docs/Diccionario de Traducción de Ahorcado.docx
@@ -117,11 +117,9 @@
             <w:tcW w:w="0" w:type="auto"/>
           </w:tcPr>
           <w:p>
-            <w:proofErr w:type="spellStart"/>
             <w:r>
               <w:t>Text_gameTitle</w:t>
             </w:r>
-            <w:proofErr w:type="spellEnd"/>
           </w:p>
         </w:tc>
         <w:tc>
@@ -183,7 +181,6 @@
             <w:tcW w:w="0" w:type="auto"/>
           </w:tcPr>
           <w:p>
-            <w:proofErr w:type="spellStart"/>
             <w:r>
               <w:t>Global_</w:t>
             </w:r>
@@ -193,7 +190,6 @@
             <w:r>
               <w:t>gIn</w:t>
             </w:r>
-            <w:proofErr w:type="spellEnd"/>
           </w:p>
         </w:tc>
         <w:tc>
@@ -258,11 +254,9 @@
             <w:tcW w:w="0" w:type="auto"/>
           </w:tcPr>
           <w:p>
-            <w:proofErr w:type="spellStart"/>
             <w:r>
               <w:t>Global_username</w:t>
             </w:r>
-            <w:proofErr w:type="spellEnd"/>
           </w:p>
         </w:tc>
         <w:tc>
@@ -324,11 +318,9 @@
             <w:tcW w:w="0" w:type="auto"/>
           </w:tcPr>
           <w:p>
-            <w:proofErr w:type="spellStart"/>
             <w:r>
               <w:t>Global_password</w:t>
             </w:r>
-            <w:proofErr w:type="spellEnd"/>
           </w:p>
         </w:tc>
         <w:tc>
@@ -393,11 +385,9 @@
             <w:tcW w:w="0" w:type="auto"/>
           </w:tcPr>
           <w:p>
-            <w:proofErr w:type="spellStart"/>
             <w:r>
               <w:t>Error_emptyUser</w:t>
             </w:r>
-            <w:proofErr w:type="spellEnd"/>
           </w:p>
         </w:tc>
         <w:tc>
@@ -507,11 +497,9 @@
             <w:tcW w:w="0" w:type="auto"/>
           </w:tcPr>
           <w:p>
-            <w:proofErr w:type="spellStart"/>
             <w:r>
               <w:t>Error_wrongCredentials</w:t>
             </w:r>
-            <w:proofErr w:type="spellEnd"/>
           </w:p>
         </w:tc>
         <w:tc>
@@ -582,11 +570,9 @@
             <w:tcW w:w="0" w:type="auto"/>
           </w:tcPr>
           <w:p>
-            <w:proofErr w:type="spellStart"/>
             <w:r>
               <w:t>Error_noConnection</w:t>
             </w:r>
-            <w:proofErr w:type="spellEnd"/>
           </w:p>
         </w:tc>
         <w:tc>
@@ -714,11 +700,9 @@
             <w:tcW w:w="0" w:type="auto"/>
           </w:tcPr>
           <w:p>
-            <w:proofErr w:type="spellStart"/>
             <w:r>
               <w:t>Button_signUp</w:t>
             </w:r>
-            <w:proofErr w:type="spellEnd"/>
           </w:p>
         </w:tc>
         <w:tc>
@@ -783,11 +767,9 @@
             <w:tcW w:w="0" w:type="auto"/>
           </w:tcPr>
           <w:p>
-            <w:proofErr w:type="spellStart"/>
             <w:r>
               <w:t>Text_fullName</w:t>
             </w:r>
-            <w:proofErr w:type="spellEnd"/>
           </w:p>
         </w:tc>
         <w:tc>
@@ -849,11 +831,9 @@
             <w:tcW w:w="0" w:type="auto"/>
           </w:tcPr>
           <w:p>
-            <w:proofErr w:type="spellStart"/>
             <w:r>
               <w:t>Text_email</w:t>
             </w:r>
-            <w:proofErr w:type="spellEnd"/>
           </w:p>
         </w:tc>
         <w:tc>
@@ -930,11 +910,9 @@
             <w:tcW w:w="0" w:type="auto"/>
           </w:tcPr>
           <w:p>
-            <w:proofErr w:type="spellStart"/>
             <w:r>
               <w:t>Text_dateOfBirth</w:t>
             </w:r>
-            <w:proofErr w:type="spellEnd"/>
           </w:p>
         </w:tc>
         <w:tc>
@@ -996,11 +974,9 @@
             <w:tcW w:w="0" w:type="auto"/>
           </w:tcPr>
           <w:p>
-            <w:proofErr w:type="spellStart"/>
             <w:r>
               <w:t>Text_phone</w:t>
             </w:r>
-            <w:proofErr w:type="spellEnd"/>
           </w:p>
         </w:tc>
         <w:tc>
@@ -1065,11 +1041,9 @@
             <w:tcW w:w="0" w:type="auto"/>
           </w:tcPr>
           <w:p>
-            <w:proofErr w:type="spellStart"/>
             <w:r>
               <w:t>Text_confirmPassword</w:t>
             </w:r>
-            <w:proofErr w:type="spellEnd"/>
           </w:p>
         </w:tc>
         <w:tc>
@@ -1144,11 +1118,9 @@
             <w:tcW w:w="0" w:type="auto"/>
           </w:tcPr>
           <w:p>
-            <w:proofErr w:type="spellStart"/>
             <w:r>
               <w:t>Button_alreadyRegistered</w:t>
             </w:r>
-            <w:proofErr w:type="spellEnd"/>
           </w:p>
         </w:tc>
         <w:tc>
@@ -1219,11 +1191,9 @@
             <w:tcW w:w="0" w:type="auto"/>
           </w:tcPr>
           <w:p>
-            <w:proofErr w:type="spellStart"/>
             <w:r>
               <w:t>Button_accept</w:t>
             </w:r>
-            <w:proofErr w:type="spellEnd"/>
           </w:p>
         </w:tc>
         <w:tc>
@@ -1283,11 +1253,9 @@
             <w:tcW w:w="0" w:type="auto"/>
           </w:tcPr>
           <w:p>
-            <w:proofErr w:type="spellStart"/>
             <w:r>
               <w:t>Button_cancel</w:t>
             </w:r>
-            <w:proofErr w:type="spellEnd"/>
           </w:p>
         </w:tc>
         <w:tc>
@@ -1352,11 +1320,9 @@
             <w:tcW w:w="0" w:type="auto"/>
           </w:tcPr>
           <w:p>
-            <w:proofErr w:type="spellStart"/>
             <w:r>
               <w:t>Button_createMatch</w:t>
             </w:r>
-            <w:proofErr w:type="spellEnd"/>
           </w:p>
         </w:tc>
         <w:tc>
@@ -1418,11 +1384,9 @@
             <w:tcW w:w="0" w:type="auto"/>
           </w:tcPr>
           <w:p>
-            <w:proofErr w:type="spellStart"/>
             <w:r>
               <w:t>Button_exit</w:t>
             </w:r>
-            <w:proofErr w:type="spellEnd"/>
           </w:p>
         </w:tc>
         <w:tc>
@@ -1487,11 +1451,9 @@
             <w:tcW w:w="0" w:type="auto"/>
           </w:tcPr>
           <w:p>
-            <w:proofErr w:type="spellStart"/>
             <w:r>
               <w:t>Button_joinMatch</w:t>
             </w:r>
-            <w:proofErr w:type="spellEnd"/>
           </w:p>
         </w:tc>
         <w:tc>
@@ -1553,11 +1515,9 @@
             <w:tcW w:w="0" w:type="auto"/>
           </w:tcPr>
           <w:p>
-            <w:proofErr w:type="spellStart"/>
             <w:r>
               <w:t>Button_logOut</w:t>
             </w:r>
-            <w:proofErr w:type="spellEnd"/>
           </w:p>
         </w:tc>
         <w:tc>
@@ -1622,11 +1582,9 @@
             <w:tcW w:w="0" w:type="auto"/>
           </w:tcPr>
           <w:p>
-            <w:proofErr w:type="spellStart"/>
             <w:r>
               <w:t>Button_ok</w:t>
             </w:r>
-            <w:proofErr w:type="spellEnd"/>
           </w:p>
         </w:tc>
         <w:tc>
@@ -1688,12 +1646,10 @@
             <w:tcW w:w="0" w:type="auto"/>
           </w:tcPr>
           <w:p>
-            <w:proofErr w:type="spellStart"/>
             <w:r>
               <w:lastRenderedPageBreak/>
               <w:t>Button_send</w:t>
             </w:r>
-            <w:proofErr w:type="spellEnd"/>
           </w:p>
         </w:tc>
         <w:tc>
@@ -1758,11 +1714,9 @@
             <w:tcW w:w="0" w:type="auto"/>
           </w:tcPr>
           <w:p>
-            <w:proofErr w:type="spellStart"/>
             <w:r>
               <w:t>Error_alreadyLogged</w:t>
             </w:r>
-            <w:proofErr w:type="spellEnd"/>
           </w:p>
         </w:tc>
         <w:tc>
@@ -1824,11 +1778,9 @@
             <w:tcW w:w="0" w:type="auto"/>
           </w:tcPr>
           <w:p>
-            <w:proofErr w:type="spellStart"/>
             <w:r>
               <w:t>Error_generic</w:t>
             </w:r>
-            <w:proofErr w:type="spellEnd"/>
           </w:p>
         </w:tc>
         <w:tc>
@@ -1912,11 +1864,9 @@
             <w:tcW w:w="0" w:type="auto"/>
           </w:tcPr>
           <w:p>
-            <w:proofErr w:type="spellStart"/>
             <w:r>
               <w:t>Error_incompleteFields</w:t>
             </w:r>
-            <w:proofErr w:type="spellEnd"/>
           </w:p>
         </w:tc>
         <w:tc>
@@ -1985,11 +1935,9 @@
             <w:tcW w:w="0" w:type="auto"/>
           </w:tcPr>
           <w:p>
-            <w:proofErr w:type="spellStart"/>
             <w:r>
               <w:t>Error_noCoincidences</w:t>
             </w:r>
-            <w:proofErr w:type="spellEnd"/>
           </w:p>
         </w:tc>
         <w:tc>
@@ -2054,11 +2002,9 @@
             <w:tcW w:w="0" w:type="auto"/>
           </w:tcPr>
           <w:p>
-            <w:proofErr w:type="spellStart"/>
             <w:r>
               <w:t>Error_retrievingData</w:t>
             </w:r>
-            <w:proofErr w:type="spellEnd"/>
           </w:p>
         </w:tc>
         <w:tc>
@@ -2145,11 +2091,9 @@
             <w:tcW w:w="0" w:type="auto"/>
           </w:tcPr>
           <w:p>
-            <w:proofErr w:type="spellStart"/>
             <w:r>
               <w:t>Error_samePassword</w:t>
             </w:r>
-            <w:proofErr w:type="spellEnd"/>
           </w:p>
         </w:tc>
         <w:tc>
@@ -2214,11 +2158,9 @@
             <w:tcW w:w="0" w:type="auto"/>
           </w:tcPr>
           <w:p>
-            <w:proofErr w:type="spellStart"/>
             <w:r>
               <w:t>Error_serverTimeout</w:t>
             </w:r>
-            <w:proofErr w:type="spellEnd"/>
           </w:p>
         </w:tc>
         <w:tc>
@@ -2333,14 +2275,12 @@
             <w:tcW w:w="0" w:type="auto"/>
           </w:tcPr>
           <w:p>
-            <w:proofErr w:type="spellStart"/>
             <w:r>
               <w:t>Error_</w:t>
             </w:r>
             <w:r>
               <w:t>profileUpdate</w:t>
             </w:r>
-            <w:proofErr w:type="spellEnd"/>
           </w:p>
         </w:tc>
         <w:tc>
@@ -2415,11 +2355,9 @@
             <w:tcW w:w="0" w:type="auto"/>
           </w:tcPr>
           <w:p>
-            <w:proofErr w:type="spellStart"/>
             <w:r>
               <w:t>Global_lang</w:t>
             </w:r>
-            <w:proofErr w:type="spellEnd"/>
           </w:p>
         </w:tc>
         <w:tc>
@@ -2481,11 +2419,9 @@
             <w:tcW w:w="0" w:type="auto"/>
           </w:tcPr>
           <w:p>
-            <w:proofErr w:type="spellStart"/>
             <w:r>
               <w:t>Global_settings</w:t>
             </w:r>
-            <w:proofErr w:type="spellEnd"/>
           </w:p>
         </w:tc>
         <w:tc>
@@ -2550,11 +2486,9 @@
             <w:tcW w:w="0" w:type="auto"/>
           </w:tcPr>
           <w:p>
-            <w:proofErr w:type="spellStart"/>
             <w:r>
               <w:t>Title_message</w:t>
             </w:r>
-            <w:proofErr w:type="spellEnd"/>
           </w:p>
         </w:tc>
         <w:tc>
@@ -2616,7 +2550,6 @@
             <w:tcW w:w="0" w:type="auto"/>
           </w:tcPr>
           <w:p>
-            <w:proofErr w:type="spellStart"/>
             <w:r>
               <w:lastRenderedPageBreak/>
               <w:t>Title_</w:t>
@@ -2627,7 +2560,6 @@
             <w:r>
               <w:t>gIn</w:t>
             </w:r>
-            <w:proofErr w:type="spellEnd"/>
           </w:p>
         </w:tc>
         <w:tc>
@@ -2692,11 +2624,9 @@
             <w:tcW w:w="0" w:type="auto"/>
           </w:tcPr>
           <w:p>
-            <w:proofErr w:type="spellStart"/>
             <w:r>
               <w:t>Title_signUp</w:t>
             </w:r>
-            <w:proofErr w:type="spellEnd"/>
           </w:p>
         </w:tc>
         <w:tc>
@@ -2770,11 +2700,9 @@
             <w:tcW w:w="0" w:type="auto"/>
           </w:tcPr>
           <w:p>
-            <w:proofErr w:type="spellStart"/>
             <w:r>
               <w:t>Title_lobby</w:t>
             </w:r>
-            <w:proofErr w:type="spellEnd"/>
           </w:p>
         </w:tc>
         <w:tc>
@@ -2846,11 +2774,9 @@
             <w:tcW w:w="0" w:type="auto"/>
           </w:tcPr>
           <w:p>
-            <w:proofErr w:type="spellStart"/>
             <w:r>
               <w:t>Title_createMatch</w:t>
             </w:r>
-            <w:proofErr w:type="spellEnd"/>
           </w:p>
         </w:tc>
         <w:tc>
@@ -2912,11 +2838,9 @@
             <w:tcW w:w="0" w:type="auto"/>
           </w:tcPr>
           <w:p>
-            <w:proofErr w:type="spellStart"/>
             <w:r>
               <w:t>Title_matchesList</w:t>
             </w:r>
-            <w:proofErr w:type="spellEnd"/>
           </w:p>
         </w:tc>
         <w:tc>
@@ -2981,11 +2905,9 @@
             <w:tcW w:w="0" w:type="auto"/>
           </w:tcPr>
           <w:p>
-            <w:proofErr w:type="spellStart"/>
             <w:r>
               <w:t>Title_profile</w:t>
             </w:r>
-            <w:proofErr w:type="spellEnd"/>
           </w:p>
         </w:tc>
         <w:tc>
@@ -3047,11 +2969,9 @@
             <w:tcW w:w="0" w:type="auto"/>
           </w:tcPr>
           <w:p>
-            <w:proofErr w:type="spellStart"/>
             <w:r>
               <w:t>Title_settings</w:t>
             </w:r>
-            <w:proofErr w:type="spellEnd"/>
           </w:p>
         </w:tc>
         <w:tc>
@@ -3116,11 +3036,9 @@
             <w:tcW w:w="0" w:type="auto"/>
           </w:tcPr>
           <w:p>
-            <w:proofErr w:type="spellStart"/>
             <w:r>
               <w:t>Title_game</w:t>
             </w:r>
-            <w:proofErr w:type="spellEnd"/>
           </w:p>
         </w:tc>
         <w:tc>
@@ -3194,11 +3112,9 @@
             <w:tcW w:w="0" w:type="auto"/>
           </w:tcPr>
           <w:p>
-            <w:proofErr w:type="spellStart"/>
             <w:r>
               <w:t>Button_forgotPassword</w:t>
             </w:r>
-            <w:proofErr w:type="spellEnd"/>
           </w:p>
         </w:tc>
         <w:tc>
@@ -3263,11 +3179,9 @@
             <w:tcW w:w="0" w:type="auto"/>
           </w:tcPr>
           <w:p>
-            <w:proofErr w:type="spellStart"/>
             <w:r>
               <w:t>Button_profile</w:t>
             </w:r>
-            <w:proofErr w:type="spellEnd"/>
           </w:p>
         </w:tc>
         <w:tc>
@@ -3329,11 +3243,9 @@
             <w:tcW w:w="0" w:type="auto"/>
           </w:tcPr>
           <w:p>
-            <w:proofErr w:type="spellStart"/>
             <w:r>
               <w:t>Title_matchSettings</w:t>
             </w:r>
-            <w:proofErr w:type="spellEnd"/>
           </w:p>
         </w:tc>
         <w:tc>
@@ -3398,11 +3310,9 @@
             <w:tcW w:w="0" w:type="auto"/>
           </w:tcPr>
           <w:p>
-            <w:proofErr w:type="spellStart"/>
             <w:r>
               <w:t>Button_editProfile</w:t>
             </w:r>
-            <w:proofErr w:type="spellEnd"/>
           </w:p>
         </w:tc>
         <w:tc>
@@ -3480,11 +3390,9 @@
             <w:tcW w:w="0" w:type="auto"/>
           </w:tcPr>
           <w:p>
-            <w:proofErr w:type="spellStart"/>
             <w:r>
               <w:t>Button_goBack</w:t>
             </w:r>
-            <w:proofErr w:type="spellEnd"/>
           </w:p>
         </w:tc>
         <w:tc>
@@ -3556,7 +3464,6 @@
             <w:tcW w:w="0" w:type="auto"/>
           </w:tcPr>
           <w:p>
-            <w:proofErr w:type="spellStart"/>
             <w:r>
               <w:t>Message_succes</w:t>
             </w:r>
@@ -3566,7 +3473,6 @@
             <w:r>
               <w:t>SignUp</w:t>
             </w:r>
-            <w:proofErr w:type="spellEnd"/>
           </w:p>
         </w:tc>
         <w:tc>
@@ -3637,11 +3543,9 @@
             <w:tcW w:w="0" w:type="auto"/>
           </w:tcPr>
           <w:p>
-            <w:proofErr w:type="spellStart"/>
             <w:r>
               <w:t>Message_confirmGoBack</w:t>
             </w:r>
-            <w:proofErr w:type="spellEnd"/>
           </w:p>
         </w:tc>
         <w:tc>
@@ -3752,11 +3656,9 @@
             <w:tcW w:w="0" w:type="auto"/>
           </w:tcPr>
           <w:p>
-            <w:proofErr w:type="spellStart"/>
             <w:r>
               <w:t>Button_yes</w:t>
             </w:r>
-            <w:proofErr w:type="spellEnd"/>
           </w:p>
         </w:tc>
         <w:tc>
@@ -3818,11 +3720,9 @@
             <w:tcW w:w="0" w:type="auto"/>
           </w:tcPr>
           <w:p>
-            <w:proofErr w:type="spellStart"/>
             <w:r>
               <w:t>Button_no</w:t>
             </w:r>
-            <w:proofErr w:type="spellEnd"/>
           </w:p>
         </w:tc>
         <w:tc>
@@ -3887,11 +3787,9 @@
             <w:tcW w:w="0" w:type="auto"/>
           </w:tcPr>
           <w:p>
-            <w:proofErr w:type="spellStart"/>
             <w:r>
               <w:t>Message_emailInUse</w:t>
             </w:r>
-            <w:proofErr w:type="spellEnd"/>
           </w:p>
         </w:tc>
         <w:tc>
@@ -3971,14 +3869,12 @@
             <w:tcW w:w="0" w:type="auto"/>
           </w:tcPr>
           <w:p>
-            <w:proofErr w:type="spellStart"/>
             <w:r>
               <w:t>Error_</w:t>
             </w:r>
             <w:r>
               <w:t>signUpFailed</w:t>
             </w:r>
-            <w:proofErr w:type="spellEnd"/>
           </w:p>
         </w:tc>
         <w:tc>
@@ -4105,7 +4001,6 @@
             <w:tcW w:w="0" w:type="auto"/>
           </w:tcPr>
           <w:p>
-            <w:proofErr w:type="spellStart"/>
             <w:r>
               <w:t>Error_</w:t>
             </w:r>
@@ -4115,7 +4010,6 @@
             <w:r>
               <w:t>gInFailed</w:t>
             </w:r>
-            <w:proofErr w:type="spellEnd"/>
           </w:p>
         </w:tc>
         <w:tc>
@@ -4203,11 +4097,9 @@
             <w:tcW w:w="0" w:type="auto"/>
           </w:tcPr>
           <w:p>
-            <w:proofErr w:type="spellStart"/>
             <w:r>
               <w:t>Message_emailCode</w:t>
             </w:r>
-            <w:proofErr w:type="spellEnd"/>
           </w:p>
         </w:tc>
         <w:tc>
@@ -4289,11 +4181,9 @@
             <w:tcW w:w="0" w:type="auto"/>
           </w:tcPr>
           <w:p>
-            <w:proofErr w:type="spellStart"/>
             <w:r>
               <w:t>Message_inputCode</w:t>
             </w:r>
-            <w:proofErr w:type="spellEnd"/>
           </w:p>
         </w:tc>
         <w:tc>
@@ -4355,11 +4245,9 @@
             <w:tcW w:w="0" w:type="auto"/>
           </w:tcPr>
           <w:p>
-            <w:proofErr w:type="spellStart"/>
             <w:r>
               <w:t>Text_newPassword</w:t>
             </w:r>
-            <w:proofErr w:type="spellEnd"/>
           </w:p>
         </w:tc>
         <w:tc>
@@ -4424,11 +4312,9 @@
             <w:tcW w:w="0" w:type="auto"/>
           </w:tcPr>
           <w:p>
-            <w:proofErr w:type="spellStart"/>
             <w:r>
               <w:t>Button_continue</w:t>
             </w:r>
-            <w:proofErr w:type="spellEnd"/>
           </w:p>
         </w:tc>
         <w:tc>
@@ -4490,11 +4376,9 @@
             <w:tcW w:w="0" w:type="auto"/>
           </w:tcPr>
           <w:p>
-            <w:proofErr w:type="spellStart"/>
             <w:r>
               <w:t>Message_passwordUpdate</w:t>
             </w:r>
-            <w:proofErr w:type="spellEnd"/>
           </w:p>
         </w:tc>
         <w:tc>
@@ -4565,11 +4449,9 @@
             <w:tcW w:w="0" w:type="auto"/>
           </w:tcPr>
           <w:p>
-            <w:proofErr w:type="spellStart"/>
             <w:r>
               <w:t>Error_invalidCode</w:t>
             </w:r>
-            <w:proofErr w:type="spellEnd"/>
           </w:p>
         </w:tc>
         <w:tc>
@@ -4673,7 +4555,6 @@
             <w:tcW w:w="0" w:type="auto"/>
           </w:tcPr>
           <w:p>
-            <w:proofErr w:type="spellStart"/>
             <w:r>
               <w:t>Error</w:t>
             </w:r>
@@ -4689,7 +4570,6 @@
             <w:r>
               <w:t>DontMatch</w:t>
             </w:r>
-            <w:proofErr w:type="spellEnd"/>
           </w:p>
         </w:tc>
         <w:tc>
@@ -4768,7 +4648,6 @@
             <w:tcW w:w="0" w:type="auto"/>
           </w:tcPr>
           <w:p>
-            <w:proofErr w:type="spellStart"/>
             <w:r>
               <w:t>Error_</w:t>
             </w:r>
@@ -4778,7 +4657,6 @@
             <w:r>
               <w:t>ed</w:t>
             </w:r>
-            <w:proofErr w:type="spellEnd"/>
           </w:p>
         </w:tc>
         <w:tc>
@@ -4865,11 +4743,9 @@
             <w:tcW w:w="0" w:type="auto"/>
           </w:tcPr>
           <w:p>
-            <w:proofErr w:type="spellStart"/>
             <w:r>
               <w:t>Button_resendCode</w:t>
             </w:r>
-            <w:proofErr w:type="spellEnd"/>
           </w:p>
         </w:tc>
         <w:tc>
@@ -4940,14 +4816,12 @@
             <w:tcW w:w="0" w:type="auto"/>
           </w:tcPr>
           <w:p>
-            <w:proofErr w:type="spellStart"/>
             <w:r>
               <w:t>Text_total</w:t>
             </w:r>
             <w:r>
               <w:t>Wins</w:t>
             </w:r>
-            <w:proofErr w:type="spellEnd"/>
           </w:p>
         </w:tc>
         <w:tc>
@@ -5015,14 +4889,12 @@
             <w:tcW w:w="0" w:type="auto"/>
           </w:tcPr>
           <w:p>
-            <w:proofErr w:type="spellStart"/>
             <w:r>
               <w:t>Text_</w:t>
             </w:r>
             <w:r>
               <w:t>losses</w:t>
             </w:r>
-            <w:proofErr w:type="spellEnd"/>
           </w:p>
         </w:tc>
         <w:tc>
@@ -5087,11 +4959,9 @@
             <w:tcW w:w="0" w:type="auto"/>
           </w:tcPr>
           <w:p>
-            <w:proofErr w:type="spellStart"/>
             <w:r>
               <w:t>Text_winPercentage</w:t>
             </w:r>
-            <w:proofErr w:type="spellEnd"/>
           </w:p>
         </w:tc>
         <w:tc>
@@ -5153,11 +5023,9 @@
             <w:tcW w:w="0" w:type="auto"/>
           </w:tcPr>
           <w:p>
-            <w:proofErr w:type="spellStart"/>
             <w:r>
               <w:t>Text_profilePic</w:t>
             </w:r>
-            <w:proofErr w:type="spellEnd"/>
           </w:p>
         </w:tc>
         <w:tc>
@@ -5222,11 +5090,9 @@
             <w:tcW w:w="0" w:type="auto"/>
           </w:tcPr>
           <w:p>
-            <w:proofErr w:type="spellStart"/>
             <w:r>
               <w:t>Button_deleteAccount</w:t>
             </w:r>
-            <w:proofErr w:type="spellEnd"/>
           </w:p>
         </w:tc>
         <w:tc>
@@ -5301,11 +5167,9 @@
             <w:tcW w:w="0" w:type="auto"/>
           </w:tcPr>
           <w:p>
-            <w:proofErr w:type="spellStart"/>
             <w:r>
               <w:t>Button_update</w:t>
             </w:r>
-            <w:proofErr w:type="spellEnd"/>
           </w:p>
         </w:tc>
         <w:tc>
@@ -5370,11 +5234,9 @@
             <w:tcW w:w="0" w:type="auto"/>
           </w:tcPr>
           <w:p>
-            <w:proofErr w:type="spellStart"/>
             <w:r>
               <w:t>Message_updateSuccess</w:t>
             </w:r>
-            <w:proofErr w:type="spellEnd"/>
           </w:p>
         </w:tc>
         <w:tc>
@@ -5448,11 +5310,9 @@
             <w:tcW w:w="0" w:type="auto"/>
           </w:tcPr>
           <w:p>
-            <w:proofErr w:type="spellStart"/>
             <w:r>
               <w:t>Message_sameData</w:t>
             </w:r>
-            <w:proofErr w:type="spellEnd"/>
           </w:p>
         </w:tc>
         <w:tc>
@@ -5529,11 +5389,9 @@
             <w:tcW w:w="0" w:type="auto"/>
           </w:tcPr>
           <w:p>
-            <w:proofErr w:type="spellStart"/>
             <w:r>
               <w:t>Button_selectFile</w:t>
             </w:r>
-            <w:proofErr w:type="spellEnd"/>
           </w:p>
         </w:tc>
         <w:tc>
@@ -5608,11 +5466,9 @@
             <w:tcW w:w="0" w:type="auto"/>
           </w:tcPr>
           <w:p>
-            <w:proofErr w:type="spellStart"/>
             <w:r>
               <w:t>Button_search</w:t>
             </w:r>
-            <w:proofErr w:type="spellEnd"/>
           </w:p>
         </w:tc>
         <w:tc>
@@ -5677,11 +5533,9 @@
             <w:tcW w:w="0" w:type="auto"/>
           </w:tcPr>
           <w:p>
-            <w:proofErr w:type="spellStart"/>
             <w:r>
               <w:t>Button_confirm</w:t>
             </w:r>
-            <w:proofErr w:type="spellEnd"/>
           </w:p>
         </w:tc>
         <w:tc>
@@ -5750,11 +5604,9 @@
             <w:tcW w:w="0" w:type="auto"/>
           </w:tcPr>
           <w:p>
-            <w:proofErr w:type="spellStart"/>
             <w:r>
               <w:t>Text_selectCategory</w:t>
             </w:r>
-            <w:proofErr w:type="spellEnd"/>
           </w:p>
         </w:tc>
         <w:tc>
@@ -5833,12 +5685,10 @@
             <w:tcW w:w="0" w:type="auto"/>
           </w:tcPr>
           <w:p>
-            <w:proofErr w:type="spellStart"/>
             <w:r>
               <w:lastRenderedPageBreak/>
               <w:t>Text_catAnimals</w:t>
             </w:r>
-            <w:proofErr w:type="spellEnd"/>
           </w:p>
         </w:tc>
         <w:tc>
@@ -5900,11 +5750,9 @@
             <w:tcW w:w="0" w:type="auto"/>
           </w:tcPr>
           <w:p>
-            <w:proofErr w:type="spellStart"/>
             <w:r>
               <w:t>Text_catFruits</w:t>
             </w:r>
-            <w:proofErr w:type="spellEnd"/>
           </w:p>
         </w:tc>
         <w:tc>
@@ -5976,11 +5824,9 @@
             <w:tcW w:w="0" w:type="auto"/>
           </w:tcPr>
           <w:p>
-            <w:proofErr w:type="spellStart"/>
             <w:r>
               <w:t>Text_catColors</w:t>
             </w:r>
-            <w:proofErr w:type="spellEnd"/>
           </w:p>
         </w:tc>
         <w:tc>
@@ -6042,11 +5888,9 @@
             <w:tcW w:w="0" w:type="auto"/>
           </w:tcPr>
           <w:p>
-            <w:proofErr w:type="spellStart"/>
             <w:r>
               <w:t>Text_catObjects</w:t>
             </w:r>
-            <w:proofErr w:type="spellEnd"/>
           </w:p>
         </w:tc>
         <w:tc>
@@ -6111,11 +5955,9 @@
             <w:tcW w:w="0" w:type="auto"/>
           </w:tcPr>
           <w:p>
-            <w:proofErr w:type="spellStart"/>
             <w:r>
               <w:t>Text_catCountries</w:t>
             </w:r>
-            <w:proofErr w:type="spellEnd"/>
           </w:p>
         </w:tc>
         <w:tc>
@@ -6184,11 +6026,9 @@
             <w:tcW w:w="0" w:type="auto"/>
           </w:tcPr>
           <w:p>
-            <w:proofErr w:type="spellStart"/>
             <w:r>
               <w:t>Text_selectWord</w:t>
             </w:r>
-            <w:proofErr w:type="spellEnd"/>
           </w:p>
         </w:tc>
         <w:tc>
@@ -6253,14 +6093,12 @@
             <w:tcW w:w="0" w:type="auto"/>
           </w:tcPr>
           <w:p>
-            <w:proofErr w:type="spellStart"/>
             <w:r>
               <w:t>Text_</w:t>
             </w:r>
             <w:r>
               <w:t>writeYourOwn</w:t>
             </w:r>
-            <w:proofErr w:type="spellEnd"/>
           </w:p>
         </w:tc>
         <w:tc>
@@ -6334,11 +6172,9 @@
             <w:tcW w:w="0" w:type="auto"/>
           </w:tcPr>
           <w:p>
-            <w:proofErr w:type="spellStart"/>
             <w:r>
               <w:t>Text_writeWord</w:t>
             </w:r>
-            <w:proofErr w:type="spellEnd"/>
           </w:p>
         </w:tc>
         <w:tc>
@@ -6409,11 +6245,9 @@
             <w:tcW w:w="0" w:type="auto"/>
           </w:tcPr>
           <w:p>
-            <w:proofErr w:type="spellStart"/>
             <w:r>
               <w:t>Button_create</w:t>
             </w:r>
-            <w:proofErr w:type="spellEnd"/>
           </w:p>
         </w:tc>
         <w:tc>
@@ -6475,11 +6309,9 @@
             <w:tcW w:w="0" w:type="auto"/>
           </w:tcPr>
           <w:p>
-            <w:proofErr w:type="spellStart"/>
             <w:r>
               <w:t>Message_creationSuccess</w:t>
             </w:r>
-            <w:proofErr w:type="spellEnd"/>
           </w:p>
         </w:tc>
         <w:tc>
@@ -6556,11 +6388,9 @@
             <w:tcW w:w="0" w:type="auto"/>
           </w:tcPr>
           <w:p>
-            <w:proofErr w:type="spellStart"/>
             <w:r>
               <w:t>Button_matchSettings</w:t>
             </w:r>
-            <w:proofErr w:type="spellEnd"/>
           </w:p>
         </w:tc>
         <w:tc>
@@ -6622,11 +6452,9 @@
             <w:tcW w:w="0" w:type="auto"/>
           </w:tcPr>
           <w:p>
-            <w:proofErr w:type="spellStart"/>
             <w:r>
               <w:t>Button_leaveMatch</w:t>
             </w:r>
-            <w:proofErr w:type="spellEnd"/>
           </w:p>
         </w:tc>
         <w:tc>
@@ -6691,11 +6519,9 @@
             <w:tcW w:w="0" w:type="auto"/>
           </w:tcPr>
           <w:p>
-            <w:proofErr w:type="spellStart"/>
             <w:r>
               <w:t>Button_startMatch</w:t>
             </w:r>
-            <w:proofErr w:type="spellEnd"/>
           </w:p>
         </w:tc>
         <w:tc>
@@ -6757,11 +6583,9 @@
             <w:tcW w:w="0" w:type="auto"/>
           </w:tcPr>
           <w:p>
-            <w:proofErr w:type="spellStart"/>
             <w:r>
               <w:t>Error_connectionEnded</w:t>
             </w:r>
-            <w:proofErr w:type="spellEnd"/>
           </w:p>
         </w:tc>
         <w:tc>
@@ -6844,11 +6668,9 @@
             <w:tcW w:w="0" w:type="auto"/>
           </w:tcPr>
           <w:p>
-            <w:proofErr w:type="spellStart"/>
             <w:r>
               <w:t>Text_chatPrompt</w:t>
             </w:r>
-            <w:proofErr w:type="spellEnd"/>
           </w:p>
         </w:tc>
         <w:tc>
@@ -6916,11 +6738,9 @@
             <w:tcW w:w="0" w:type="auto"/>
           </w:tcPr>
           <w:p>
-            <w:proofErr w:type="spellStart"/>
             <w:r>
               <w:t>Button_saveSettings</w:t>
             </w:r>
-            <w:proofErr w:type="spellEnd"/>
           </w:p>
         </w:tc>
         <w:tc>
@@ -6983,11 +6803,9 @@
             <w:tcW w:w="0" w:type="auto"/>
           </w:tcPr>
           <w:p>
-            <w:proofErr w:type="spellStart"/>
             <w:r>
               <w:t>Button_kickPlayer</w:t>
             </w:r>
-            <w:proofErr w:type="spellEnd"/>
           </w:p>
         </w:tc>
         <w:tc>
@@ -7049,11 +6867,9 @@
             <w:tcW w:w="0" w:type="auto"/>
           </w:tcPr>
           <w:p>
-            <w:proofErr w:type="spellStart"/>
             <w:r>
               <w:t>Message_wordChange</w:t>
             </w:r>
-            <w:proofErr w:type="spellEnd"/>
           </w:p>
         </w:tc>
         <w:tc>
@@ -7125,14 +6941,12 @@
             <w:tcW w:w="0" w:type="auto"/>
           </w:tcPr>
           <w:p>
-            <w:proofErr w:type="spellStart"/>
             <w:r>
               <w:t>Message_</w:t>
             </w:r>
             <w:r>
               <w:t>backNoSave</w:t>
             </w:r>
-            <w:proofErr w:type="spellEnd"/>
           </w:p>
         </w:tc>
         <w:tc>
@@ -7258,11 +7072,9 @@
             <w:tcW w:w="0" w:type="auto"/>
           </w:tcPr>
           <w:p>
-            <w:proofErr w:type="spellStart"/>
             <w:r>
               <w:t>Text_you</w:t>
             </w:r>
-            <w:proofErr w:type="spellEnd"/>
           </w:p>
         </w:tc>
         <w:tc>
@@ -7327,11 +7139,9 @@
             <w:tcW w:w="0" w:type="auto"/>
           </w:tcPr>
           <w:p>
-            <w:proofErr w:type="spellStart"/>
             <w:r>
               <w:t>Text_awaitingOpponent</w:t>
             </w:r>
-            <w:proofErr w:type="spellEnd"/>
           </w:p>
         </w:tc>
         <w:tc>
@@ -7393,12 +7203,10 @@
             <w:tcW w:w="0" w:type="auto"/>
           </w:tcPr>
           <w:p>
-            <w:proofErr w:type="spellStart"/>
             <w:r>
               <w:lastRenderedPageBreak/>
               <w:t>Text_availableMatches</w:t>
             </w:r>
-            <w:proofErr w:type="spellEnd"/>
           </w:p>
         </w:tc>
         <w:tc>
@@ -7470,11 +7278,9 @@
             <w:tcW w:w="0" w:type="auto"/>
           </w:tcPr>
           <w:p>
-            <w:proofErr w:type="spellStart"/>
             <w:r>
               <w:t>Button_viewProfile</w:t>
             </w:r>
-            <w:proofErr w:type="spellEnd"/>
           </w:p>
         </w:tc>
         <w:tc>
@@ -7536,11 +7342,9 @@
             <w:tcW w:w="0" w:type="auto"/>
           </w:tcPr>
           <w:p>
-            <w:proofErr w:type="spellStart"/>
             <w:r>
               <w:t>Text_created</w:t>
             </w:r>
-            <w:proofErr w:type="spellEnd"/>
           </w:p>
         </w:tc>
         <w:tc>
@@ -7611,14 +7415,12 @@
             <w:tcW w:w="0" w:type="auto"/>
           </w:tcPr>
           <w:p>
-            <w:proofErr w:type="spellStart"/>
             <w:r>
               <w:t>Text</w:t>
             </w:r>
             <w:r>
               <w:t>_today</w:t>
             </w:r>
-            <w:proofErr w:type="spellEnd"/>
           </w:p>
         </w:tc>
         <w:tc>
@@ -7680,11 +7482,9 @@
             <w:tcW w:w="0" w:type="auto"/>
           </w:tcPr>
           <w:p>
-            <w:proofErr w:type="spellStart"/>
             <w:r>
               <w:t>Text_awaitingStart</w:t>
             </w:r>
-            <w:proofErr w:type="spellEnd"/>
           </w:p>
         </w:tc>
         <w:tc>
@@ -7715,15 +7515,7 @@
               <w:cnfStyle w:val="000000000000" w:firstRow="0" w:lastRow="0" w:firstColumn="0" w:lastColumn="0" w:oddVBand="0" w:evenVBand="0" w:oddHBand="0" w:evenHBand="0" w:firstRowFirstColumn="0" w:firstRowLastColumn="0" w:lastRowFirstColumn="0" w:lastRowLastColumn="0"/>
             </w:pPr>
             <w:r>
-              <w:t>Esperando a que {</w:t>
-            </w:r>
-            <w:proofErr w:type="spellStart"/>
-            <w:r>
-              <w:t>username</w:t>
-            </w:r>
-            <w:proofErr w:type="spellEnd"/>
-            <w:r>
-              <w:t>} comience la partida</w:t>
+              <w:t>Esperando a que {username} comience la partida</w:t>
             </w:r>
           </w:p>
         </w:tc>
@@ -7757,11 +7549,9 @@
             <w:tcW w:w="0" w:type="auto"/>
           </w:tcPr>
           <w:p>
-            <w:proofErr w:type="spellStart"/>
             <w:r>
               <w:t>Text_playerJoined</w:t>
             </w:r>
-            <w:proofErr w:type="spellEnd"/>
           </w:p>
         </w:tc>
         <w:tc>
@@ -7792,15 +7582,7 @@
               <w:cnfStyle w:val="000000100000" w:firstRow="0" w:lastRow="0" w:firstColumn="0" w:lastColumn="0" w:oddVBand="0" w:evenVBand="0" w:oddHBand="1" w:evenHBand="0" w:firstRowFirstColumn="0" w:firstRowLastColumn="0" w:lastRowFirstColumn="0" w:lastRowLastColumn="0"/>
             </w:pPr>
             <w:r>
-              <w:t>{</w:t>
-            </w:r>
-            <w:proofErr w:type="spellStart"/>
-            <w:r>
-              <w:t>username</w:t>
-            </w:r>
-            <w:proofErr w:type="spellEnd"/>
-            <w:r>
-              <w:t>} se ha unido a la partida</w:t>
+              <w:t>{username} se ha unido a la partida</w:t>
             </w:r>
           </w:p>
         </w:tc>
@@ -7831,11 +7613,9 @@
             <w:tcW w:w="0" w:type="auto"/>
           </w:tcPr>
           <w:p>
-            <w:proofErr w:type="spellStart"/>
             <w:r>
               <w:t>Text_rightGuess</w:t>
             </w:r>
-            <w:proofErr w:type="spellEnd"/>
           </w:p>
         </w:tc>
         <w:tc>
@@ -7900,11 +7680,9 @@
             <w:tcW w:w="0" w:type="auto"/>
           </w:tcPr>
           <w:p>
-            <w:proofErr w:type="spellStart"/>
             <w:r>
               <w:t>Text_wrongGuess</w:t>
             </w:r>
-            <w:proofErr w:type="spellEnd"/>
           </w:p>
         </w:tc>
         <w:tc>
@@ -7958,14 +7736,12 @@
             <w:r>
               <w:t xml:space="preserve"> Te quedan {</w:t>
             </w:r>
-            <w:proofErr w:type="spellStart"/>
             <w:r>
               <w:t>a</w:t>
             </w:r>
             <w:r>
               <w:t>ttempts</w:t>
             </w:r>
-            <w:proofErr w:type="spellEnd"/>
             <w:r>
               <w:t xml:space="preserve">} </w:t>
             </w:r>
@@ -8026,11 +7802,9 @@
             <w:tcW w:w="0" w:type="auto"/>
           </w:tcPr>
           <w:p>
-            <w:proofErr w:type="spellStart"/>
             <w:r>
               <w:t>Message_confirmLeave</w:t>
             </w:r>
-            <w:proofErr w:type="spellEnd"/>
           </w:p>
         </w:tc>
         <w:tc>
@@ -8095,11 +7869,9 @@
             <w:tcW w:w="0" w:type="auto"/>
           </w:tcPr>
           <w:p>
-            <w:proofErr w:type="spellStart"/>
             <w:r>
               <w:t>Append_noPenalization</w:t>
             </w:r>
-            <w:proofErr w:type="spellEnd"/>
           </w:p>
         </w:tc>
         <w:tc>
@@ -8179,11 +7951,9 @@
             <w:tcW w:w="0" w:type="auto"/>
           </w:tcPr>
           <w:p>
-            <w:proofErr w:type="spellStart"/>
             <w:r>
               <w:t>Text_playerLeft</w:t>
             </w:r>
-            <w:proofErr w:type="spellEnd"/>
           </w:p>
         </w:tc>
         <w:tc>
@@ -8214,15 +7984,7 @@
               <w:cnfStyle w:val="000000000000" w:firstRow="0" w:lastRow="0" w:firstColumn="0" w:lastColumn="0" w:oddVBand="0" w:evenVBand="0" w:oddHBand="0" w:evenHBand="0" w:firstRowFirstColumn="0" w:firstRowLastColumn="0" w:lastRowFirstColumn="0" w:lastRowLastColumn="0"/>
             </w:pPr>
             <w:r>
-              <w:t>{</w:t>
-            </w:r>
-            <w:proofErr w:type="spellStart"/>
-            <w:r>
-              <w:t>username</w:t>
-            </w:r>
-            <w:proofErr w:type="spellEnd"/>
-            <w:r>
-              <w:t>} ha abandonado la partida</w:t>
+              <w:t>{username} ha abandonado la partida</w:t>
             </w:r>
           </w:p>
         </w:tc>
@@ -8256,11 +8018,9 @@
             <w:tcW w:w="0" w:type="auto"/>
           </w:tcPr>
           <w:p>
-            <w:proofErr w:type="spellStart"/>
             <w:r>
               <w:t>Message_hostLeft</w:t>
             </w:r>
-            <w:proofErr w:type="spellEnd"/>
           </w:p>
         </w:tc>
         <w:tc>
@@ -8322,11 +8082,9 @@
             <w:tcW w:w="0" w:type="auto"/>
           </w:tcPr>
           <w:p>
-            <w:proofErr w:type="spellStart"/>
             <w:r>
               <w:t>Append_penalization</w:t>
             </w:r>
-            <w:proofErr w:type="spellEnd"/>
           </w:p>
         </w:tc>
         <w:tc>
@@ -8409,14 +8167,12 @@
             <w:tcW w:w="0" w:type="auto"/>
           </w:tcPr>
           <w:p>
-            <w:proofErr w:type="spellStart"/>
             <w:r>
               <w:t>Message</w:t>
             </w:r>
             <w:r>
               <w:t>_youLeft</w:t>
             </w:r>
-            <w:proofErr w:type="spellEnd"/>
           </w:p>
         </w:tc>
         <w:tc>
@@ -8484,14 +8240,12 @@
             <w:tcW w:w="0" w:type="auto"/>
           </w:tcPr>
           <w:p>
-            <w:proofErr w:type="spellStart"/>
             <w:r>
               <w:t>Message</w:t>
             </w:r>
             <w:r>
               <w:t>_opponentLeft</w:t>
             </w:r>
-            <w:proofErr w:type="spellEnd"/>
           </w:p>
         </w:tc>
         <w:tc>
@@ -8588,11 +8342,9 @@
             <w:tcW w:w="0" w:type="auto"/>
           </w:tcPr>
           <w:p>
-            <w:proofErr w:type="spellStart"/>
             <w:r>
               <w:t>Message_confirmKick</w:t>
             </w:r>
-            <w:proofErr w:type="spellEnd"/>
           </w:p>
         </w:tc>
         <w:tc>
@@ -8719,12 +8471,10 @@
             <w:tcW w:w="0" w:type="auto"/>
           </w:tcPr>
           <w:p>
-            <w:proofErr w:type="spellStart"/>
             <w:r>
               <w:lastRenderedPageBreak/>
               <w:t>Message_gotKicked</w:t>
             </w:r>
-            <w:proofErr w:type="spellEnd"/>
           </w:p>
         </w:tc>
         <w:tc>
@@ -8810,11 +8560,9 @@
             <w:tcW w:w="0" w:type="auto"/>
           </w:tcPr>
           <w:p>
-            <w:proofErr w:type="spellStart"/>
             <w:r>
               <w:t>Append_pointsLost</w:t>
             </w:r>
-            <w:proofErr w:type="spellEnd"/>
           </w:p>
         </w:tc>
         <w:tc>
@@ -8876,11 +8624,9 @@
             <w:tcW w:w="0" w:type="auto"/>
           </w:tcPr>
           <w:p>
-            <w:proofErr w:type="spellStart"/>
             <w:r>
               <w:t>Message_kickedPlayer</w:t>
             </w:r>
-            <w:proofErr w:type="spellEnd"/>
           </w:p>
         </w:tc>
         <w:tc>
@@ -8911,15 +8657,7 @@
               <w:cnfStyle w:val="000000000000" w:firstRow="0" w:lastRow="0" w:firstColumn="0" w:lastColumn="0" w:oddVBand="0" w:evenVBand="0" w:oddHBand="0" w:evenHBand="0" w:firstRowFirstColumn="0" w:firstRowLastColumn="0" w:lastRowFirstColumn="0" w:lastRowLastColumn="0"/>
             </w:pPr>
             <w:r>
-              <w:t>Expulsaste a {</w:t>
-            </w:r>
-            <w:proofErr w:type="spellStart"/>
-            <w:r>
-              <w:t>username</w:t>
-            </w:r>
-            <w:proofErr w:type="spellEnd"/>
-            <w:r>
-              <w:t>}</w:t>
+              <w:t>Expulsaste a {username}</w:t>
             </w:r>
           </w:p>
         </w:tc>
@@ -8971,14 +8709,12 @@
             <w:tcW w:w="0" w:type="auto"/>
           </w:tcPr>
           <w:p>
-            <w:proofErr w:type="spellStart"/>
             <w:r>
               <w:t>Message</w:t>
             </w:r>
             <w:r>
               <w:t>_kickedMidGame</w:t>
             </w:r>
-            <w:proofErr w:type="spellEnd"/>
           </w:p>
         </w:tc>
         <w:tc>
@@ -9058,11 +8794,9 @@
             <w:tcW w:w="0" w:type="auto"/>
           </w:tcPr>
           <w:p>
-            <w:proofErr w:type="spellStart"/>
             <w:r>
               <w:t>Append_noPointsLost</w:t>
             </w:r>
-            <w:proofErr w:type="spellEnd"/>
           </w:p>
         </w:tc>
         <w:tc>
@@ -9135,14 +8869,12 @@
             <w:tcW w:w="0" w:type="auto"/>
           </w:tcPr>
           <w:p>
-            <w:proofErr w:type="spellStart"/>
             <w:r>
               <w:t>Message_</w:t>
             </w:r>
             <w:r>
               <w:t>wordGuessed</w:t>
             </w:r>
-            <w:proofErr w:type="spellEnd"/>
           </w:p>
         </w:tc>
         <w:tc>
@@ -9242,11 +8974,9 @@
             <w:tcW w:w="0" w:type="auto"/>
           </w:tcPr>
           <w:p>
-            <w:proofErr w:type="spellStart"/>
             <w:r>
               <w:t>Message_opponentWon</w:t>
             </w:r>
-            <w:proofErr w:type="spellEnd"/>
           </w:p>
         </w:tc>
         <w:tc>
@@ -9277,15 +9007,7 @@
               <w:cnfStyle w:val="000000000000" w:firstRow="0" w:lastRow="0" w:firstColumn="0" w:lastColumn="0" w:oddVBand="0" w:evenVBand="0" w:oddHBand="0" w:evenHBand="0" w:firstRowFirstColumn="0" w:firstRowLastColumn="0" w:lastRowFirstColumn="0" w:lastRowLastColumn="0"/>
             </w:pPr>
             <w:r>
-              <w:t>{</w:t>
-            </w:r>
-            <w:proofErr w:type="spellStart"/>
-            <w:r>
-              <w:t>username</w:t>
-            </w:r>
-            <w:proofErr w:type="spellEnd"/>
-            <w:r>
-              <w:t>} adivinó tu palabra. ¡Suerte para la próxima!</w:t>
+              <w:t>{username} adivinó tu palabra. ¡Suerte para la próxima!</w:t>
             </w:r>
           </w:p>
         </w:tc>
@@ -9326,11 +9048,9 @@
             <w:tcW w:w="0" w:type="auto"/>
           </w:tcPr>
           <w:p>
-            <w:proofErr w:type="spellStart"/>
             <w:r>
               <w:t>Message_wordNotGuessed</w:t>
             </w:r>
-            <w:proofErr w:type="spellEnd"/>
           </w:p>
         </w:tc>
         <w:tc>
@@ -9430,11 +9150,9 @@
             <w:tcW w:w="0" w:type="auto"/>
           </w:tcPr>
           <w:p>
-            <w:proofErr w:type="spellStart"/>
             <w:r>
               <w:t>Message_opponentLost</w:t>
             </w:r>
-            <w:proofErr w:type="spellEnd"/>
           </w:p>
         </w:tc>
         <w:tc>
@@ -9465,15 +9183,7 @@
               <w:cnfStyle w:val="000000000000" w:firstRow="0" w:lastRow="0" w:firstColumn="0" w:lastColumn="0" w:oddVBand="0" w:evenVBand="0" w:oddHBand="0" w:evenHBand="0" w:firstRowFirstColumn="0" w:firstRowLastColumn="0" w:lastRowFirstColumn="0" w:lastRowLastColumn="0"/>
             </w:pPr>
             <w:r>
-              <w:t>¡Felicidades! {</w:t>
-            </w:r>
-            <w:proofErr w:type="spellStart"/>
-            <w:r>
-              <w:t>username</w:t>
-            </w:r>
-            <w:proofErr w:type="spellEnd"/>
-            <w:r>
-              <w:t>} no adivinó tu palabra. Ganaste 5 puntos</w:t>
+              <w:t>¡Felicidades! {username} no adivinó tu palabra. Ganaste 5 puntos</w:t>
             </w:r>
           </w:p>
         </w:tc>
@@ -9522,14 +9232,12 @@
             <w:tcW w:w="0" w:type="auto"/>
           </w:tcPr>
           <w:p>
-            <w:proofErr w:type="spellStart"/>
             <w:r>
               <w:t>Error_</w:t>
             </w:r>
             <w:r>
               <w:t>scoresUpdFailed</w:t>
             </w:r>
-            <w:proofErr w:type="spellEnd"/>
           </w:p>
         </w:tc>
         <w:tc>
@@ -9610,7 +9318,6 @@
             <w:tcW w:w="0" w:type="auto"/>
           </w:tcPr>
           <w:p>
-            <w:proofErr w:type="spellStart"/>
             <w:r>
               <w:lastRenderedPageBreak/>
               <w:t>Error_</w:t>
@@ -9618,7 +9325,6 @@
             <w:r>
               <w:t>messageNotSent</w:t>
             </w:r>
-            <w:proofErr w:type="spellEnd"/>
           </w:p>
         </w:tc>
         <w:tc>
@@ -9695,11 +9401,9 @@
             <w:tcW w:w="0" w:type="auto"/>
           </w:tcPr>
           <w:p>
-            <w:proofErr w:type="spellStart"/>
             <w:r>
               <w:t>Text_language</w:t>
             </w:r>
-            <w:proofErr w:type="spellEnd"/>
           </w:p>
         </w:tc>
         <w:tc>
@@ -9761,11 +9465,9 @@
             <w:tcW w:w="0" w:type="auto"/>
           </w:tcPr>
           <w:p>
-            <w:proofErr w:type="spellStart"/>
             <w:r>
               <w:t>Text_useSystemDefault</w:t>
             </w:r>
-            <w:proofErr w:type="spellEnd"/>
           </w:p>
         </w:tc>
         <w:tc>
@@ -9816,6 +9518,73 @@
                 <w:lang w:val="de-DE"/>
               </w:rPr>
               <w:t>Systemstandard verwenden</w:t>
+            </w:r>
+          </w:p>
+        </w:tc>
+      </w:tr>
+      <w:tr>
+        <w:trPr>
+          <w:cnfStyle w:val="000000100000" w:firstRow="0" w:lastRow="0" w:firstColumn="0" w:lastColumn="0" w:oddVBand="0" w:evenVBand="0" w:oddHBand="1" w:evenHBand="0" w:firstRowFirstColumn="0" w:firstRowLastColumn="0" w:lastRowFirstColumn="0" w:lastRowLastColumn="0"/>
+        </w:trPr>
+        <w:tc>
+          <w:tcPr>
+            <w:cnfStyle w:val="001000000000" w:firstRow="0" w:lastRow="0" w:firstColumn="1" w:lastColumn="0" w:oddVBand="0" w:evenVBand="0" w:oddHBand="0" w:evenHBand="0" w:firstRowFirstColumn="0" w:firstRowLastColumn="0" w:lastRowFirstColumn="0" w:lastRowLastColumn="0"/>
+            <w:tcW w:w="0" w:type="auto"/>
+          </w:tcPr>
+          <w:p>
+            <w:r>
+              <w:t>Button_refresh</w:t>
+            </w:r>
+          </w:p>
+        </w:tc>
+        <w:tc>
+          <w:tcPr>
+            <w:tcW w:w="0" w:type="auto"/>
+          </w:tcPr>
+          <w:p>
+            <w:pPr>
+              <w:cnfStyle w:val="000000100000" w:firstRow="0" w:lastRow="0" w:firstColumn="0" w:lastColumn="0" w:oddVBand="0" w:evenVBand="0" w:oddHBand="1" w:evenHBand="0" w:firstRowFirstColumn="0" w:firstRowLastColumn="0" w:lastRowFirstColumn="0" w:lastRowLastColumn="0"/>
+              <w:rPr>
+                <w:lang w:val="en-US"/>
+              </w:rPr>
+            </w:pPr>
+            <w:r>
+              <w:rPr>
+                <w:lang w:val="en-US"/>
+              </w:rPr>
+              <w:t>Refresh</w:t>
+            </w:r>
+          </w:p>
+        </w:tc>
+        <w:tc>
+          <w:tcPr>
+            <w:tcW w:w="0" w:type="auto"/>
+          </w:tcPr>
+          <w:p>
+            <w:pPr>
+              <w:cnfStyle w:val="000000100000" w:firstRow="0" w:lastRow="0" w:firstColumn="0" w:lastColumn="0" w:oddVBand="0" w:evenVBand="0" w:oddHBand="1" w:evenHBand="0" w:firstRowFirstColumn="0" w:firstRowLastColumn="0" w:lastRowFirstColumn="0" w:lastRowLastColumn="0"/>
+            </w:pPr>
+            <w:r>
+              <w:t>Refrescar</w:t>
+            </w:r>
+          </w:p>
+        </w:tc>
+        <w:tc>
+          <w:tcPr>
+            <w:tcW w:w="0" w:type="auto"/>
+          </w:tcPr>
+          <w:p>
+            <w:pPr>
+              <w:cnfStyle w:val="000000100000" w:firstRow="0" w:lastRow="0" w:firstColumn="0" w:lastColumn="0" w:oddVBand="0" w:evenVBand="0" w:oddHBand="1" w:evenHBand="0" w:firstRowFirstColumn="0" w:firstRowLastColumn="0" w:lastRowFirstColumn="0" w:lastRowLastColumn="0"/>
+              <w:rPr>
+                <w:lang w:val="de-DE"/>
+              </w:rPr>
+            </w:pPr>
+            <w:r>
+              <w:rPr>
+                <w:lang w:val="de-DE"/>
+              </w:rPr>
+              <w:t>Aktualisieren</w:t>
             </w:r>
           </w:p>
         </w:tc>
@@ -10904,6 +10673,7 @@
                 <w:bCs w:val="0"/>
                 <w:lang w:val="en-US"/>
               </w:rPr>
+              <w:lastRenderedPageBreak/>
               <w:t>Apple</w:t>
             </w:r>
           </w:p>
@@ -10962,7 +10732,6 @@
                 <w:bCs w:val="0"/>
                 <w:lang w:val="en-US"/>
               </w:rPr>
-              <w:lastRenderedPageBreak/>
               <w:t>Pear</w:t>
             </w:r>
           </w:p>
@@ -12541,6 +12310,7 @@
                 <w:bCs w:val="0"/>
                 <w:lang w:val="en-US"/>
               </w:rPr>
+              <w:lastRenderedPageBreak/>
               <w:t>Brown</w:t>
             </w:r>
           </w:p>
@@ -12601,7 +12371,6 @@
                 <w:bCs w:val="0"/>
                 <w:lang w:val="en-US"/>
               </w:rPr>
-              <w:lastRenderedPageBreak/>
               <w:t>White</w:t>
             </w:r>
           </w:p>
@@ -14089,6 +13858,7 @@
                 <w:bCs w:val="0"/>
                 <w:lang w:val="en-US"/>
               </w:rPr>
+              <w:lastRenderedPageBreak/>
               <w:t>Germany</w:t>
             </w:r>
           </w:p>
@@ -14147,7 +13917,6 @@
                 <w:bCs w:val="0"/>
                 <w:lang w:val="en-US"/>
               </w:rPr>
-              <w:lastRenderedPageBreak/>
               <w:t>Canada</w:t>
             </w:r>
           </w:p>
@@ -16149,11 +15918,12 @@
 </file>
 
 <file path=customXml/item1.xml><?xml version="1.0" encoding="utf-8"?>
-<p:properties xmlns:p="http://schemas.microsoft.com/office/2006/metadata/properties" xmlns:xsi="http://www.w3.org/2001/XMLSchema-instance" xmlns:pc="http://schemas.microsoft.com/office/infopath/2007/PartnerControls">
-  <documentManagement>
-    <_activity xmlns="4ca4fff8-4ca6-45fa-9984-80d7acf9a5ff" xsi:nil="true"/>
-  </documentManagement>
-</p:properties>
+<?mso-contentType ?>
+<FormTemplates xmlns="http://schemas.microsoft.com/sharepoint/v3/contenttype/forms">
+  <Display>DocumentLibraryForm</Display>
+  <Edit>DocumentLibraryForm</Edit>
+  <New>DocumentLibraryForm</New>
+</FormTemplates>
 </file>
 
 <file path=customXml/item2.xml><?xml version="1.0" encoding="utf-8"?>
@@ -16390,20 +16160,17 @@
 </file>
 
 <file path=customXml/item3.xml><?xml version="1.0" encoding="utf-8"?>
-<?mso-contentType ?>
-<FormTemplates xmlns="http://schemas.microsoft.com/sharepoint/v3/contenttype/forms">
-  <Display>DocumentLibraryForm</Display>
-  <Edit>DocumentLibraryForm</Edit>
-  <New>DocumentLibraryForm</New>
-</FormTemplates>
+<p:properties xmlns:p="http://schemas.microsoft.com/office/2006/metadata/properties" xmlns:xsi="http://www.w3.org/2001/XMLSchema-instance" xmlns:pc="http://schemas.microsoft.com/office/infopath/2007/PartnerControls">
+  <documentManagement>
+    <_activity xmlns="4ca4fff8-4ca6-45fa-9984-80d7acf9a5ff" xsi:nil="true"/>
+  </documentManagement>
+</p:properties>
 </file>
 
 <file path=customXml/itemProps1.xml><?xml version="1.0" encoding="utf-8"?>
-<ds:datastoreItem xmlns:ds="http://schemas.openxmlformats.org/officeDocument/2006/customXml" ds:itemID="{22B57F83-0715-4FCE-9C34-A46577001F5A}">
+<ds:datastoreItem xmlns:ds="http://schemas.openxmlformats.org/officeDocument/2006/customXml" ds:itemID="{F5286B03-E2F0-4073-9473-292DF7C6FCB5}">
   <ds:schemaRefs>
-    <ds:schemaRef ds:uri="http://schemas.microsoft.com/office/2006/metadata/properties"/>
-    <ds:schemaRef ds:uri="http://schemas.microsoft.com/office/infopath/2007/PartnerControls"/>
-    <ds:schemaRef ds:uri="4ca4fff8-4ca6-45fa-9984-80d7acf9a5ff"/>
+    <ds:schemaRef ds:uri="http://schemas.microsoft.com/sharepoint/v3/contenttype/forms"/>
   </ds:schemaRefs>
 </ds:datastoreItem>
 </file>
@@ -16428,9 +16195,11 @@
 </file>
 
 <file path=customXml/itemProps3.xml><?xml version="1.0" encoding="utf-8"?>
-<ds:datastoreItem xmlns:ds="http://schemas.openxmlformats.org/officeDocument/2006/customXml" ds:itemID="{F5286B03-E2F0-4073-9473-292DF7C6FCB5}">
+<ds:datastoreItem xmlns:ds="http://schemas.openxmlformats.org/officeDocument/2006/customXml" ds:itemID="{22B57F83-0715-4FCE-9C34-A46577001F5A}">
   <ds:schemaRefs>
-    <ds:schemaRef ds:uri="http://schemas.microsoft.com/sharepoint/v3/contenttype/forms"/>
+    <ds:schemaRef ds:uri="http://schemas.microsoft.com/office/2006/metadata/properties"/>
+    <ds:schemaRef ds:uri="http://schemas.microsoft.com/office/infopath/2007/PartnerControls"/>
+    <ds:schemaRef ds:uri="4ca4fff8-4ca6-45fa-9984-80d7acf9a5ff"/>
   </ds:schemaRefs>
 </ds:datastoreItem>
 </file>
</xml_diff>

<commit_message>
Modify: Added Players string to Diccionario. Modify: Added Text_playersInMatch to Resources. Modify: Removed test message from CreateMatchViewModel. Modify: MatchesListViewModel now retrieves available matches from the database. Modify: MatchPage now hides the proper buttons needed to the guesser. Modify: MatchesListPage now dynamically creates joinable matches as buttons from the available matches in the database. Fix: Minor bug in date when creating a match in MatchService. Updated service reference in client.
</commit_message>
<xml_diff>
--- a/docs/Diccionario de Traducción de Ahorcado.docx
+++ b/docs/Diccionario de Traducción de Ahorcado.docx
@@ -9585,6 +9585,70 @@
                 <w:lang w:val="de-DE"/>
               </w:rPr>
               <w:t>Aktualisieren</w:t>
+            </w:r>
+          </w:p>
+        </w:tc>
+      </w:tr>
+      <w:tr>
+        <w:tc>
+          <w:tcPr>
+            <w:cnfStyle w:val="001000000000" w:firstRow="0" w:lastRow="0" w:firstColumn="1" w:lastColumn="0" w:oddVBand="0" w:evenVBand="0" w:oddHBand="0" w:evenHBand="0" w:firstRowFirstColumn="0" w:firstRowLastColumn="0" w:lastRowFirstColumn="0" w:lastRowLastColumn="0"/>
+            <w:tcW w:w="0" w:type="auto"/>
+          </w:tcPr>
+          <w:p>
+            <w:r>
+              <w:t>Text_playersInMatch</w:t>
+            </w:r>
+          </w:p>
+        </w:tc>
+        <w:tc>
+          <w:tcPr>
+            <w:tcW w:w="0" w:type="auto"/>
+          </w:tcPr>
+          <w:p>
+            <w:pPr>
+              <w:cnfStyle w:val="000000000000" w:firstRow="0" w:lastRow="0" w:firstColumn="0" w:lastColumn="0" w:oddVBand="0" w:evenVBand="0" w:oddHBand="0" w:evenHBand="0" w:firstRowFirstColumn="0" w:firstRowLastColumn="0" w:lastRowFirstColumn="0" w:lastRowLastColumn="0"/>
+              <w:rPr>
+                <w:lang w:val="en-US"/>
+              </w:rPr>
+            </w:pPr>
+            <w:r>
+              <w:rPr>
+                <w:lang w:val="en-US"/>
+              </w:rPr>
+              <w:t>Players:</w:t>
+            </w:r>
+          </w:p>
+        </w:tc>
+        <w:tc>
+          <w:tcPr>
+            <w:tcW w:w="0" w:type="auto"/>
+          </w:tcPr>
+          <w:p>
+            <w:pPr>
+              <w:cnfStyle w:val="000000000000" w:firstRow="0" w:lastRow="0" w:firstColumn="0" w:lastColumn="0" w:oddVBand="0" w:evenVBand="0" w:oddHBand="0" w:evenHBand="0" w:firstRowFirstColumn="0" w:firstRowLastColumn="0" w:lastRowFirstColumn="0" w:lastRowLastColumn="0"/>
+            </w:pPr>
+            <w:r>
+              <w:t>Jugadores:</w:t>
+            </w:r>
+          </w:p>
+        </w:tc>
+        <w:tc>
+          <w:tcPr>
+            <w:tcW w:w="0" w:type="auto"/>
+          </w:tcPr>
+          <w:p>
+            <w:pPr>
+              <w:cnfStyle w:val="000000000000" w:firstRow="0" w:lastRow="0" w:firstColumn="0" w:lastColumn="0" w:oddVBand="0" w:evenVBand="0" w:oddHBand="0" w:evenHBand="0" w:firstRowFirstColumn="0" w:firstRowLastColumn="0" w:lastRowFirstColumn="0" w:lastRowLastColumn="0"/>
+              <w:rPr>
+                <w:lang w:val="de-DE"/>
+              </w:rPr>
+            </w:pPr>
+            <w:r>
+              <w:rPr>
+                <w:lang w:val="de-DE"/>
+              </w:rPr>
+              <w:t>Spieler</w:t>
             </w:r>
           </w:p>
         </w:tc>
@@ -15918,12 +15982,11 @@
 </file>
 
 <file path=customXml/item1.xml><?xml version="1.0" encoding="utf-8"?>
-<?mso-contentType ?>
-<FormTemplates xmlns="http://schemas.microsoft.com/sharepoint/v3/contenttype/forms">
-  <Display>DocumentLibraryForm</Display>
-  <Edit>DocumentLibraryForm</Edit>
-  <New>DocumentLibraryForm</New>
-</FormTemplates>
+<p:properties xmlns:p="http://schemas.microsoft.com/office/2006/metadata/properties" xmlns:xsi="http://www.w3.org/2001/XMLSchema-instance" xmlns:pc="http://schemas.microsoft.com/office/infopath/2007/PartnerControls">
+  <documentManagement>
+    <_activity xmlns="4ca4fff8-4ca6-45fa-9984-80d7acf9a5ff" xsi:nil="true"/>
+  </documentManagement>
+</p:properties>
 </file>
 
 <file path=customXml/item2.xml><?xml version="1.0" encoding="utf-8"?>
@@ -16160,17 +16223,20 @@
 </file>
 
 <file path=customXml/item3.xml><?xml version="1.0" encoding="utf-8"?>
-<p:properties xmlns:p="http://schemas.microsoft.com/office/2006/metadata/properties" xmlns:xsi="http://www.w3.org/2001/XMLSchema-instance" xmlns:pc="http://schemas.microsoft.com/office/infopath/2007/PartnerControls">
-  <documentManagement>
-    <_activity xmlns="4ca4fff8-4ca6-45fa-9984-80d7acf9a5ff" xsi:nil="true"/>
-  </documentManagement>
-</p:properties>
+<?mso-contentType ?>
+<FormTemplates xmlns="http://schemas.microsoft.com/sharepoint/v3/contenttype/forms">
+  <Display>DocumentLibraryForm</Display>
+  <Edit>DocumentLibraryForm</Edit>
+  <New>DocumentLibraryForm</New>
+</FormTemplates>
 </file>
 
 <file path=customXml/itemProps1.xml><?xml version="1.0" encoding="utf-8"?>
-<ds:datastoreItem xmlns:ds="http://schemas.openxmlformats.org/officeDocument/2006/customXml" ds:itemID="{F5286B03-E2F0-4073-9473-292DF7C6FCB5}">
+<ds:datastoreItem xmlns:ds="http://schemas.openxmlformats.org/officeDocument/2006/customXml" ds:itemID="{22B57F83-0715-4FCE-9C34-A46577001F5A}">
   <ds:schemaRefs>
-    <ds:schemaRef ds:uri="http://schemas.microsoft.com/sharepoint/v3/contenttype/forms"/>
+    <ds:schemaRef ds:uri="http://schemas.microsoft.com/office/2006/metadata/properties"/>
+    <ds:schemaRef ds:uri="http://schemas.microsoft.com/office/infopath/2007/PartnerControls"/>
+    <ds:schemaRef ds:uri="4ca4fff8-4ca6-45fa-9984-80d7acf9a5ff"/>
   </ds:schemaRefs>
 </ds:datastoreItem>
 </file>
@@ -16195,11 +16261,9 @@
 </file>
 
 <file path=customXml/itemProps3.xml><?xml version="1.0" encoding="utf-8"?>
-<ds:datastoreItem xmlns:ds="http://schemas.openxmlformats.org/officeDocument/2006/customXml" ds:itemID="{22B57F83-0715-4FCE-9C34-A46577001F5A}">
+<ds:datastoreItem xmlns:ds="http://schemas.openxmlformats.org/officeDocument/2006/customXml" ds:itemID="{F5286B03-E2F0-4073-9473-292DF7C6FCB5}">
   <ds:schemaRefs>
-    <ds:schemaRef ds:uri="http://schemas.microsoft.com/office/2006/metadata/properties"/>
-    <ds:schemaRef ds:uri="http://schemas.microsoft.com/office/infopath/2007/PartnerControls"/>
-    <ds:schemaRef ds:uri="4ca4fff8-4ca6-45fa-9984-80d7acf9a5ff"/>
+    <ds:schemaRef ds:uri="http://schemas.microsoft.com/sharepoint/v3/contenttype/forms"/>
   </ds:schemaRefs>
 </ds:datastoreItem>
 </file>
</xml_diff>